<commit_message>
Positionering med grid-linjer på om oss sidan
</commit_message>
<xml_diff>
--- a/Rapport.docx
+++ b/Rapport.docx
@@ -377,8 +377,8 @@
           <w:color w:val="000000"/>
         </w:rPr>
         <w:sectPr>
-          <w:headerReference w:type="default" r:id="rId7"/>
-          <w:footerReference w:type="default" r:id="rId8"/>
+          <w:headerReference w:type="default" r:id="rId8"/>
+          <w:footerReference w:type="default" r:id="rId9"/>
           <w:pgSz w:w="11906" w:h="16838"/>
           <w:pgMar w:top="1134" w:right="1346" w:bottom="760" w:left="1485" w:header="720" w:footer="720" w:gutter="0"/>
           <w:cols w:space="0"/>
@@ -412,7 +412,7 @@
                     <pic:cNvPicPr/>
                   </pic:nvPicPr>
                   <pic:blipFill>
-                    <a:blip r:embed="rId9">
+                    <a:blip r:embed="rId10">
                       <a:extLst>
                         <a:ext uri="{28A0092B-C50C-407E-A947-70E740481C1C}">
                           <a14:useLocalDpi xmlns:a14="http://schemas.microsoft.com/office/drawing/2010/main" val="0"/>
@@ -451,15 +451,6 @@
         </w:rPr>
         <w:t>Maria Westin</w:t>
       </w:r>
-    </w:p>
-    <w:p>
-      <w:pPr>
-        <w:pStyle w:val="Textbody"/>
-        <w:outlineLvl w:val="0"/>
-        <w:rPr>
-          <w:rFonts w:ascii="FreeSans" w:hAnsi="FreeSans"/>
-        </w:rPr>
-      </w:pPr>
     </w:p>
     <w:p>
       <w:pPr>
@@ -1719,8 +1710,8 @@
         <w:jc w:val="left"/>
         <w:outlineLvl w:val="0"/>
         <w:sectPr>
-          <w:headerReference w:type="default" r:id="rId10"/>
-          <w:footerReference w:type="default" r:id="rId11"/>
+          <w:headerReference w:type="default" r:id="rId11"/>
+          <w:footerReference w:type="default" r:id="rId12"/>
           <w:pgSz w:w="11906" w:h="16838"/>
           <w:pgMar w:top="1700" w:right="2098" w:bottom="1326" w:left="2098" w:header="1134" w:footer="760" w:gutter="0"/>
           <w:pgNumType w:fmt="lowerRoman"/>
@@ -2070,11 +2061,11 @@
         <w:jc w:val="left"/>
       </w:pPr>
       <w:r>
-        <w:t xml:space="preserve">En källförteckning (lista över referenser) upprättas i slutet av rapporten för att ge läsaren en samlad upplysning om samtliga källor som du refererar, citerar eller av annat skäl hänvisar till i den löpande texten. Källor ska anges så noggrant att läsaren ska kunna kontrollera dem, om de finns tillgängliga </w:t>
+        <w:t xml:space="preserve">En källförteckning (lista över referenser) upprättas i slutet av rapporten för att ge läsaren en samlad upplysning om samtliga källor som du refererar, citerar eller av annat skäl hänvisar till i den löpande texten. Källor ska anges </w:t>
       </w:r>
       <w:r>
         <w:lastRenderedPageBreak/>
-        <w:t>via bibliotek eller på Internet. Det förekommer även att muntliga källor och annan korrespondens inkluderas i källförteckningen, men det är ovanligt i tekniska rapporter.</w:t>
+        <w:t>så noggrant att läsaren ska kunna kontrollera dem, om de finns tillgängliga via bibliotek eller på Internet. Det förekommer även att muntliga källor och annan korrespondens inkluderas i källförteckningen, men det är ovanligt i tekniska rapporter.</w:t>
       </w:r>
     </w:p>
     <w:p>
@@ -2343,6 +2334,7 @@
       </w:pPr>
       <w:bookmarkStart w:id="0" w:name="__RefHeading__1550_1780816771"/>
       <w:r>
+        <w:lastRenderedPageBreak/>
         <w:t>Automatiskt numrerade källhänvisningar</w:t>
       </w:r>
       <w:bookmarkEnd w:id="0"/>
@@ -2366,11 +2358,7 @@
       <w:proofErr w:type="spellEnd"/>
       <w:proofErr w:type="gramEnd"/>
       <w:r>
-        <w:t xml:space="preserve">-mall stödjer ett sätt att göra det på och precis som sägs </w:t>
-      </w:r>
-      <w:r>
-        <w:lastRenderedPageBreak/>
-        <w:t>ovan hittar du exempel på källförteckningar skapad med den metoden i slutet av mallen.</w:t>
+        <w:t>-mall stödjer ett sätt att göra det på och precis som sägs ovan hittar du exempel på källförteckningar skapad med den metoden i slutet av mallen.</w:t>
       </w:r>
     </w:p>
     <w:p>
@@ -2563,6 +2551,7 @@
         <w:jc w:val="left"/>
       </w:pPr>
       <w:r>
+        <w:lastRenderedPageBreak/>
         <w:t xml:space="preserve">Tabell 1 visar en exempeltabell. Automatisk numrering fungerar på samma sätt som för figurer men du använder dig av variabeln ”Tabell” </w:t>
       </w:r>
       <w:proofErr w:type="gramStart"/>
@@ -3744,6 +3733,14 @@
     </w:p>
     <w:p>
       <w:pPr>
+        <w:pStyle w:val="Rubrik2"/>
+      </w:pPr>
+      <w:r>
+        <w:t>Planering</w:t>
+      </w:r>
+    </w:p>
+    <w:p>
+      <w:pPr>
         <w:pStyle w:val="Textbody"/>
         <w:jc w:val="left"/>
       </w:pPr>
@@ -3790,13 +3787,180 @@
     <w:p>
       <w:pPr>
         <w:pStyle w:val="Textbody"/>
+        <w:keepNext/>
         <w:jc w:val="left"/>
       </w:pPr>
       <w:r>
+        <w:rPr>
+          <w:noProof/>
+        </w:rPr>
+        <mc:AlternateContent>
+          <mc:Choice Requires="wps">
+            <w:drawing>
+              <wp:anchor distT="0" distB="0" distL="114300" distR="114300" simplePos="0" relativeHeight="251662336" behindDoc="0" locked="0" layoutInCell="1" allowOverlap="1" wp14:anchorId="64A4CC53" wp14:editId="1D6DCB97">
+                <wp:simplePos x="0" y="0"/>
+                <wp:positionH relativeFrom="column">
+                  <wp:posOffset>2573020</wp:posOffset>
+                </wp:positionH>
+                <wp:positionV relativeFrom="paragraph">
+                  <wp:posOffset>2487930</wp:posOffset>
+                </wp:positionV>
+                <wp:extent cx="2289810" cy="635"/>
+                <wp:effectExtent l="0" t="0" r="0" b="0"/>
+                <wp:wrapNone/>
+                <wp:docPr id="2120273438" name="Textruta 1"/>
+                <wp:cNvGraphicFramePr/>
+                <a:graphic xmlns:a="http://schemas.openxmlformats.org/drawingml/2006/main">
+                  <a:graphicData uri="http://schemas.microsoft.com/office/word/2010/wordprocessingShape">
+                    <wps:wsp>
+                      <wps:cNvSpPr txBox="1"/>
+                      <wps:spPr>
+                        <a:xfrm>
+                          <a:off x="0" y="0"/>
+                          <a:ext cx="2289810" cy="635"/>
+                        </a:xfrm>
+                        <a:prstGeom prst="rect">
+                          <a:avLst/>
+                        </a:prstGeom>
+                        <a:solidFill>
+                          <a:prstClr val="white"/>
+                        </a:solidFill>
+                        <a:ln>
+                          <a:noFill/>
+                        </a:ln>
+                      </wps:spPr>
+                      <wps:txbx>
+                        <w:txbxContent>
+                          <w:p>
+                            <w:pPr>
+                              <w:pStyle w:val="Beskrivning"/>
+                              <w:rPr>
+                                <w:rFonts w:cs="FreeSerif"/>
+                              </w:rPr>
+                            </w:pPr>
+                            <w:r>
+                              <w:t xml:space="preserve">Figur 2 – </w:t>
+                            </w:r>
+                            <w:proofErr w:type="spellStart"/>
+                            <w:r>
+                              <w:t>Wireframe</w:t>
+                            </w:r>
+                            <w:proofErr w:type="spellEnd"/>
+                            <w:r>
+                              <w:t xml:space="preserve"> desktop</w:t>
+                            </w:r>
+                          </w:p>
+                        </w:txbxContent>
+                      </wps:txbx>
+                      <wps:bodyPr rot="0" spcFirstLastPara="0" vertOverflow="overflow" horzOverflow="overflow" vert="horz" wrap="square" lIns="0" tIns="0" rIns="0" bIns="0" numCol="1" spcCol="0" rtlCol="0" fromWordArt="0" anchor="t" anchorCtr="0" forceAA="0" compatLnSpc="1">
+                        <a:prstTxWarp prst="textNoShape">
+                          <a:avLst/>
+                        </a:prstTxWarp>
+                        <a:spAutoFit/>
+                      </wps:bodyPr>
+                    </wps:wsp>
+                  </a:graphicData>
+                </a:graphic>
+              </wp:anchor>
+            </w:drawing>
+          </mc:Choice>
+          <mc:Fallback>
+            <w:pict>
+              <v:shapetype w14:anchorId="64A4CC53" id="_x0000_t202" coordsize="21600,21600" o:spt="202" path="m,l,21600r21600,l21600,xe">
+                <v:stroke joinstyle="miter"/>
+                <v:path gradientshapeok="t" o:connecttype="rect"/>
+              </v:shapetype>
+              <v:shape id="Textruta 1" o:spid="_x0000_s1026" type="#_x0000_t202" style="position:absolute;margin-left:202.6pt;margin-top:195.9pt;width:180.3pt;height:.05pt;z-index:251662336;visibility:visible;mso-wrap-style:square;mso-wrap-distance-left:9pt;mso-wrap-distance-top:0;mso-wrap-distance-right:9pt;mso-wrap-distance-bottom:0;mso-position-horizontal:absolute;mso-position-horizontal-relative:text;mso-position-vertical:absolute;mso-position-vertical-relative:text;v-text-anchor:top" o:gfxdata="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" stroked="f">
+                <v:textbox style="mso-fit-shape-to-text:t" inset="0,0,0,0">
+                  <w:txbxContent>
+                    <w:p>
+                      <w:pPr>
+                        <w:pStyle w:val="Beskrivning"/>
+                        <w:rPr>
+                          <w:rFonts w:cs="FreeSerif"/>
+                        </w:rPr>
+                      </w:pPr>
+                      <w:r>
+                        <w:t xml:space="preserve">Figur 2 – </w:t>
+                      </w:r>
+                      <w:proofErr w:type="spellStart"/>
+                      <w:r>
+                        <w:t>Wireframe</w:t>
+                      </w:r>
+                      <w:proofErr w:type="spellEnd"/>
+                      <w:r>
+                        <w:t xml:space="preserve"> desktop</w:t>
+                      </w:r>
+                    </w:p>
+                  </w:txbxContent>
+                </v:textbox>
+              </v:shape>
+            </w:pict>
+          </mc:Fallback>
+        </mc:AlternateContent>
+      </w:r>
+      <w:r>
         <w:drawing>
-          <wp:inline distT="0" distB="0" distL="0" distR="0" wp14:anchorId="35C1F9C5" wp14:editId="5F035E09">
-            <wp:extent cx="4895850" cy="6017895"/>
-            <wp:effectExtent l="0" t="0" r="0" b="1905"/>
+          <wp:anchor distT="0" distB="0" distL="114300" distR="114300" simplePos="0" relativeHeight="251659264" behindDoc="0" locked="0" layoutInCell="1" allowOverlap="1" wp14:anchorId="50370085" wp14:editId="14FB9004">
+            <wp:simplePos x="0" y="0"/>
+            <wp:positionH relativeFrom="column">
+              <wp:posOffset>2573020</wp:posOffset>
+            </wp:positionH>
+            <wp:positionV relativeFrom="paragraph">
+              <wp:posOffset>11430</wp:posOffset>
+            </wp:positionV>
+            <wp:extent cx="2289970" cy="2419350"/>
+            <wp:effectExtent l="0" t="0" r="0" b="0"/>
+            <wp:wrapNone/>
+            <wp:docPr id="2002402939" name="Bildobjekt 1"/>
+            <wp:cNvGraphicFramePr>
+              <a:graphicFrameLocks xmlns:a="http://schemas.openxmlformats.org/drawingml/2006/main" noChangeAspect="1"/>
+            </wp:cNvGraphicFramePr>
+            <a:graphic xmlns:a="http://schemas.openxmlformats.org/drawingml/2006/main">
+              <a:graphicData uri="http://schemas.openxmlformats.org/drawingml/2006/picture">
+                <pic:pic xmlns:pic="http://schemas.openxmlformats.org/drawingml/2006/picture">
+                  <pic:nvPicPr>
+                    <pic:cNvPr id="2002402939" name=""/>
+                    <pic:cNvPicPr/>
+                  </pic:nvPicPr>
+                  <pic:blipFill>
+                    <a:blip r:embed="rId13" cstate="print">
+                      <a:extLst>
+                        <a:ext uri="{28A0092B-C50C-407E-A947-70E740481C1C}">
+                          <a14:useLocalDpi xmlns:a14="http://schemas.microsoft.com/office/drawing/2010/main" val="0"/>
+                        </a:ext>
+                      </a:extLst>
+                    </a:blip>
+                    <a:stretch>
+                      <a:fillRect/>
+                    </a:stretch>
+                  </pic:blipFill>
+                  <pic:spPr>
+                    <a:xfrm>
+                      <a:off x="0" y="0"/>
+                      <a:ext cx="2289970" cy="2419350"/>
+                    </a:xfrm>
+                    <a:prstGeom prst="rect">
+                      <a:avLst/>
+                    </a:prstGeom>
+                  </pic:spPr>
+                </pic:pic>
+              </a:graphicData>
+            </a:graphic>
+            <wp14:sizeRelH relativeFrom="page">
+              <wp14:pctWidth>0</wp14:pctWidth>
+            </wp14:sizeRelH>
+            <wp14:sizeRelV relativeFrom="page">
+              <wp14:pctHeight>0</wp14:pctHeight>
+            </wp14:sizeRelV>
+          </wp:anchor>
+        </w:drawing>
+      </w:r>
+      <w:r>
+        <w:drawing>
+          <wp:inline distT="0" distB="0" distL="0" distR="0" wp14:anchorId="35C1F9C5" wp14:editId="50413CC4">
+            <wp:extent cx="2316966" cy="2847975"/>
+            <wp:effectExtent l="0" t="0" r="7620" b="0"/>
             <wp:docPr id="564361892" name="Bildobjekt 1"/>
             <wp:cNvGraphicFramePr>
               <a:graphicFrameLocks xmlns:a="http://schemas.openxmlformats.org/drawingml/2006/main" noChangeAspect="1"/>
@@ -3809,7 +3973,7 @@
                     <pic:cNvPicPr/>
                   </pic:nvPicPr>
                   <pic:blipFill>
-                    <a:blip r:embed="rId12"/>
+                    <a:blip r:embed="rId14"/>
                     <a:stretch>
                       <a:fillRect/>
                     </a:stretch>
@@ -3817,7 +3981,7 @@
                   <pic:spPr>
                     <a:xfrm>
                       <a:off x="0" y="0"/>
-                      <a:ext cx="4895850" cy="6017895"/>
+                      <a:ext cx="2346100" cy="2883786"/>
                     </a:xfrm>
                     <a:prstGeom prst="rect">
                       <a:avLst/>
@@ -3832,14 +3996,1923 @@
     </w:p>
     <w:p>
       <w:pPr>
-        <w:pStyle w:val="Textbody"/>
+        <w:pStyle w:val="Beskrivning"/>
         <w:jc w:val="left"/>
       </w:pPr>
+      <w:r>
+        <w:t xml:space="preserve">Figur </w:t>
+      </w:r>
+      <w:r>
+        <w:fldChar w:fldCharType="begin"/>
+      </w:r>
+      <w:r>
+        <w:instrText xml:space="preserve"> SEQ Figur \* ARABIC </w:instrText>
+      </w:r>
+      <w:r>
+        <w:fldChar w:fldCharType="separate"/>
+      </w:r>
+      <w:r>
+        <w:rPr>
+          <w:noProof/>
+        </w:rPr>
+        <w:t>1</w:t>
+      </w:r>
+      <w:r>
+        <w:fldChar w:fldCharType="end"/>
+      </w:r>
+      <w:r>
+        <w:t xml:space="preserve"> – </w:t>
+      </w:r>
+      <w:proofErr w:type="spellStart"/>
+      <w:r>
+        <w:t>Wireframes</w:t>
+      </w:r>
+      <w:proofErr w:type="spellEnd"/>
+      <w:r>
+        <w:t xml:space="preserve"> mobil</w:t>
+      </w:r>
     </w:p>
     <w:p>
       <w:pPr>
         <w:pStyle w:val="Textbody"/>
         <w:jc w:val="left"/>
+      </w:pPr>
+    </w:p>
+    <w:p>
+      <w:pPr>
+        <w:pStyle w:val="Textbody"/>
+        <w:jc w:val="left"/>
+      </w:pPr>
+      <w:r>
+        <w:t xml:space="preserve">Sedan gick jag vidare och gjorde en </w:t>
+      </w:r>
+      <w:proofErr w:type="spellStart"/>
+      <w:r>
+        <w:t>wireframe</w:t>
+      </w:r>
+      <w:proofErr w:type="spellEnd"/>
+      <w:r>
+        <w:t xml:space="preserve"> för desktop. Här valde jag att fokusera på sortiment-sidan som jag tyckte var svårast att få till.</w:t>
+      </w:r>
+    </w:p>
+    <w:p>
+      <w:pPr>
+        <w:pStyle w:val="Textbody"/>
+        <w:jc w:val="left"/>
+      </w:pPr>
+      <w:r>
+        <w:t xml:space="preserve">När strukturen var planerad i mina </w:t>
+      </w:r>
+      <w:proofErr w:type="spellStart"/>
+      <w:r>
+        <w:t>wireframes</w:t>
+      </w:r>
+      <w:proofErr w:type="spellEnd"/>
+      <w:r>
+        <w:t xml:space="preserve"> skulle jag planera utseendet genom att göra </w:t>
+      </w:r>
+      <w:proofErr w:type="spellStart"/>
+      <w:r>
+        <w:t>mockups</w:t>
+      </w:r>
+      <w:proofErr w:type="spellEnd"/>
+      <w:r>
+        <w:t xml:space="preserve"> i </w:t>
+      </w:r>
+      <w:proofErr w:type="spellStart"/>
+      <w:r>
+        <w:t>Figma</w:t>
+      </w:r>
+      <w:proofErr w:type="spellEnd"/>
+      <w:r>
+        <w:t xml:space="preserve">. Men innan jag kunde börja med det behövde jag en logotyp för mitt fiktiva företag. </w:t>
+      </w:r>
+    </w:p>
+    <w:p>
+      <w:pPr>
+        <w:pStyle w:val="Textbody"/>
+        <w:jc w:val="left"/>
+        <w:rPr>
+          <w:noProof/>
+        </w:rPr>
+      </w:pPr>
+      <w:r>
+        <w:rPr>
+          <w:noProof/>
+        </w:rPr>
+        <w:drawing>
+          <wp:anchor distT="0" distB="0" distL="114300" distR="114300" simplePos="0" relativeHeight="251660288" behindDoc="0" locked="0" layoutInCell="1" allowOverlap="1" wp14:anchorId="0F14F9BF" wp14:editId="388B8ADB">
+            <wp:simplePos x="0" y="0"/>
+            <wp:positionH relativeFrom="column">
+              <wp:posOffset>3897630</wp:posOffset>
+            </wp:positionH>
+            <wp:positionV relativeFrom="paragraph">
+              <wp:posOffset>52070</wp:posOffset>
+            </wp:positionV>
+            <wp:extent cx="942975" cy="942975"/>
+            <wp:effectExtent l="0" t="0" r="9525" b="9525"/>
+            <wp:wrapSquare wrapText="bothSides"/>
+            <wp:docPr id="1578624466" name="Bildobjekt 1"/>
+            <wp:cNvGraphicFramePr>
+              <a:graphicFrameLocks xmlns:a="http://schemas.openxmlformats.org/drawingml/2006/main" noChangeAspect="1"/>
+            </wp:cNvGraphicFramePr>
+            <a:graphic xmlns:a="http://schemas.openxmlformats.org/drawingml/2006/main">
+              <a:graphicData uri="http://schemas.openxmlformats.org/drawingml/2006/picture">
+                <pic:pic xmlns:pic="http://schemas.openxmlformats.org/drawingml/2006/picture">
+                  <pic:nvPicPr>
+                    <pic:cNvPr id="0" name="Picture 1"/>
+                    <pic:cNvPicPr>
+                      <a:picLocks noChangeAspect="1" noChangeArrowheads="1"/>
+                    </pic:cNvPicPr>
+                  </pic:nvPicPr>
+                  <pic:blipFill>
+                    <a:blip r:embed="rId15">
+                      <a:extLst>
+                        <a:ext uri="{28A0092B-C50C-407E-A947-70E740481C1C}">
+                          <a14:useLocalDpi xmlns:a14="http://schemas.microsoft.com/office/drawing/2010/main" val="0"/>
+                        </a:ext>
+                      </a:extLst>
+                    </a:blip>
+                    <a:srcRect/>
+                    <a:stretch>
+                      <a:fillRect/>
+                    </a:stretch>
+                  </pic:blipFill>
+                  <pic:spPr bwMode="auto">
+                    <a:xfrm>
+                      <a:off x="0" y="0"/>
+                      <a:ext cx="942975" cy="942975"/>
+                    </a:xfrm>
+                    <a:prstGeom prst="rect">
+                      <a:avLst/>
+                    </a:prstGeom>
+                    <a:noFill/>
+                    <a:ln>
+                      <a:noFill/>
+                    </a:ln>
+                  </pic:spPr>
+                </pic:pic>
+              </a:graphicData>
+            </a:graphic>
+            <wp14:sizeRelH relativeFrom="page">
+              <wp14:pctWidth>0</wp14:pctWidth>
+            </wp14:sizeRelH>
+            <wp14:sizeRelV relativeFrom="page">
+              <wp14:pctHeight>0</wp14:pctHeight>
+            </wp14:sizeRelV>
+          </wp:anchor>
+        </w:drawing>
+      </w:r>
+      <w:r>
+        <w:t>Logotypen</w:t>
+      </w:r>
+      <w:r>
+        <w:t xml:space="preserve"> designade jag i </w:t>
+      </w:r>
+      <w:proofErr w:type="spellStart"/>
+      <w:r>
+        <w:t>Photopea</w:t>
+      </w:r>
+      <w:proofErr w:type="spellEnd"/>
+      <w:r>
+        <w:t xml:space="preserve">. </w:t>
+      </w:r>
+      <w:r>
+        <w:t>Under arbetet med logotypen hittade jag också en grundfärg som jag ville använda i den grafiska profilen.</w:t>
+      </w:r>
+      <w:r>
+        <w:rPr>
+          <w:noProof/>
+        </w:rPr>
+        <w:t xml:space="preserve"> </w:t>
+      </w:r>
+    </w:p>
+    <w:p>
+      <w:pPr>
+        <w:pStyle w:val="Textbody"/>
+        <w:jc w:val="left"/>
+      </w:pPr>
+      <w:r>
+        <w:rPr>
+          <w:noProof/>
+        </w:rPr>
+        <mc:AlternateContent>
+          <mc:Choice Requires="wps">
+            <w:drawing>
+              <wp:anchor distT="0" distB="0" distL="114300" distR="114300" simplePos="0" relativeHeight="251664384" behindDoc="0" locked="0" layoutInCell="1" allowOverlap="1" wp14:anchorId="7DE94C9D" wp14:editId="3E97952C">
+                <wp:simplePos x="0" y="0"/>
+                <wp:positionH relativeFrom="column">
+                  <wp:posOffset>3896995</wp:posOffset>
+                </wp:positionH>
+                <wp:positionV relativeFrom="paragraph">
+                  <wp:posOffset>317500</wp:posOffset>
+                </wp:positionV>
+                <wp:extent cx="962025" cy="635"/>
+                <wp:effectExtent l="0" t="0" r="9525" b="0"/>
+                <wp:wrapSquare wrapText="bothSides"/>
+                <wp:docPr id="1821497914" name="Textruta 1"/>
+                <wp:cNvGraphicFramePr/>
+                <a:graphic xmlns:a="http://schemas.openxmlformats.org/drawingml/2006/main">
+                  <a:graphicData uri="http://schemas.microsoft.com/office/word/2010/wordprocessingShape">
+                    <wps:wsp>
+                      <wps:cNvSpPr txBox="1"/>
+                      <wps:spPr>
+                        <a:xfrm>
+                          <a:off x="0" y="0"/>
+                          <a:ext cx="962025" cy="635"/>
+                        </a:xfrm>
+                        <a:prstGeom prst="rect">
+                          <a:avLst/>
+                        </a:prstGeom>
+                        <a:solidFill>
+                          <a:prstClr val="white"/>
+                        </a:solidFill>
+                        <a:ln>
+                          <a:noFill/>
+                        </a:ln>
+                      </wps:spPr>
+                      <wps:txbx>
+                        <w:txbxContent>
+                          <w:p>
+                            <w:pPr>
+                              <w:pStyle w:val="Beskrivning"/>
+                              <w:rPr>
+                                <w:rFonts w:cs="FreeSerif"/>
+                                <w:noProof/>
+                              </w:rPr>
+                            </w:pPr>
+                            <w:r>
+                              <w:t>Figur 3 - Logga</w:t>
+                            </w:r>
+                          </w:p>
+                        </w:txbxContent>
+                      </wps:txbx>
+                      <wps:bodyPr rot="0" spcFirstLastPara="0" vertOverflow="overflow" horzOverflow="overflow" vert="horz" wrap="square" lIns="0" tIns="0" rIns="0" bIns="0" numCol="1" spcCol="0" rtlCol="0" fromWordArt="0" anchor="t" anchorCtr="0" forceAA="0" compatLnSpc="1">
+                        <a:prstTxWarp prst="textNoShape">
+                          <a:avLst/>
+                        </a:prstTxWarp>
+                        <a:spAutoFit/>
+                      </wps:bodyPr>
+                    </wps:wsp>
+                  </a:graphicData>
+                </a:graphic>
+                <wp14:sizeRelH relativeFrom="margin">
+                  <wp14:pctWidth>0</wp14:pctWidth>
+                </wp14:sizeRelH>
+              </wp:anchor>
+            </w:drawing>
+          </mc:Choice>
+          <mc:Fallback>
+            <w:pict>
+              <v:shape w14:anchorId="7DE94C9D" id="_x0000_s1027" type="#_x0000_t202" style="position:absolute;margin-left:306.85pt;margin-top:25pt;width:75.75pt;height:.05pt;z-index:251664384;visibility:visible;mso-wrap-style:square;mso-width-percent:0;mso-wrap-distance-left:9pt;mso-wrap-distance-top:0;mso-wrap-distance-right:9pt;mso-wrap-distance-bottom:0;mso-position-horizontal:absolute;mso-position-horizontal-relative:text;mso-position-vertical:absolute;mso-position-vertical-relative:text;mso-width-percent:0;mso-width-relative:margin;v-text-anchor:top" o:gfxdata="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" stroked="f">
+                <v:textbox style="mso-fit-shape-to-text:t" inset="0,0,0,0">
+                  <w:txbxContent>
+                    <w:p>
+                      <w:pPr>
+                        <w:pStyle w:val="Beskrivning"/>
+                        <w:rPr>
+                          <w:rFonts w:cs="FreeSerif"/>
+                          <w:noProof/>
+                        </w:rPr>
+                      </w:pPr>
+                      <w:r>
+                        <w:t>Figur 3 - Logga</w:t>
+                      </w:r>
+                    </w:p>
+                  </w:txbxContent>
+                </v:textbox>
+                <w10:wrap type="square"/>
+              </v:shape>
+            </w:pict>
+          </mc:Fallback>
+        </mc:AlternateContent>
+      </w:r>
+      <w:r>
+        <w:t xml:space="preserve">När logotyp och grundfärg var klart satte jag i gång med att utveckla den grafiska profilen i </w:t>
+      </w:r>
+      <w:proofErr w:type="spellStart"/>
+      <w:r>
+        <w:t>Figma</w:t>
+      </w:r>
+      <w:proofErr w:type="spellEnd"/>
+      <w:r>
+        <w:t xml:space="preserve">. Vilket resulterade i följande </w:t>
+      </w:r>
+      <w:proofErr w:type="spellStart"/>
+      <w:r>
+        <w:t>mockups</w:t>
+      </w:r>
+      <w:proofErr w:type="spellEnd"/>
+      <w:r>
+        <w:t>.</w:t>
+      </w:r>
+    </w:p>
+    <w:p>
+      <w:pPr>
+        <w:pStyle w:val="Textbody"/>
+        <w:keepNext/>
+        <w:jc w:val="left"/>
+      </w:pPr>
+      <w:r>
+        <w:rPr>
+          <w:noProof/>
+        </w:rPr>
+        <w:lastRenderedPageBreak/>
+        <mc:AlternateContent>
+          <mc:Choice Requires="wps">
+            <w:drawing>
+              <wp:anchor distT="0" distB="0" distL="114300" distR="114300" simplePos="0" relativeHeight="251667456" behindDoc="0" locked="0" layoutInCell="1" allowOverlap="1" wp14:anchorId="0E7C4442" wp14:editId="021A50A5">
+                <wp:simplePos x="0" y="0"/>
+                <wp:positionH relativeFrom="column">
+                  <wp:posOffset>2571750</wp:posOffset>
+                </wp:positionH>
+                <wp:positionV relativeFrom="paragraph">
+                  <wp:posOffset>2782570</wp:posOffset>
+                </wp:positionV>
+                <wp:extent cx="2320290" cy="635"/>
+                <wp:effectExtent l="0" t="0" r="0" b="0"/>
+                <wp:wrapNone/>
+                <wp:docPr id="1226718434" name="Textruta 1"/>
+                <wp:cNvGraphicFramePr/>
+                <a:graphic xmlns:a="http://schemas.openxmlformats.org/drawingml/2006/main">
+                  <a:graphicData uri="http://schemas.microsoft.com/office/word/2010/wordprocessingShape">
+                    <wps:wsp>
+                      <wps:cNvSpPr txBox="1"/>
+                      <wps:spPr>
+                        <a:xfrm>
+                          <a:off x="0" y="0"/>
+                          <a:ext cx="2320290" cy="635"/>
+                        </a:xfrm>
+                        <a:prstGeom prst="rect">
+                          <a:avLst/>
+                        </a:prstGeom>
+                        <a:solidFill>
+                          <a:prstClr val="white"/>
+                        </a:solidFill>
+                        <a:ln>
+                          <a:noFill/>
+                        </a:ln>
+                      </wps:spPr>
+                      <wps:txbx>
+                        <w:txbxContent>
+                          <w:p>
+                            <w:pPr>
+                              <w:pStyle w:val="Beskrivning"/>
+                              <w:rPr>
+                                <w:rFonts w:cs="FreeSerif"/>
+                              </w:rPr>
+                            </w:pPr>
+                            <w:r>
+                              <w:t xml:space="preserve">Figur 5 – </w:t>
+                            </w:r>
+                            <w:proofErr w:type="spellStart"/>
+                            <w:r>
+                              <w:t>Mockup</w:t>
+                            </w:r>
+                            <w:proofErr w:type="spellEnd"/>
+                            <w:r>
+                              <w:t xml:space="preserve"> desktop</w:t>
+                            </w:r>
+                          </w:p>
+                        </w:txbxContent>
+                      </wps:txbx>
+                      <wps:bodyPr rot="0" spcFirstLastPara="0" vertOverflow="overflow" horzOverflow="overflow" vert="horz" wrap="square" lIns="0" tIns="0" rIns="0" bIns="0" numCol="1" spcCol="0" rtlCol="0" fromWordArt="0" anchor="t" anchorCtr="0" forceAA="0" compatLnSpc="1">
+                        <a:prstTxWarp prst="textNoShape">
+                          <a:avLst/>
+                        </a:prstTxWarp>
+                        <a:spAutoFit/>
+                      </wps:bodyPr>
+                    </wps:wsp>
+                  </a:graphicData>
+                </a:graphic>
+              </wp:anchor>
+            </w:drawing>
+          </mc:Choice>
+          <mc:Fallback>
+            <w:pict>
+              <v:shape w14:anchorId="0E7C4442" id="_x0000_s1028" type="#_x0000_t202" style="position:absolute;margin-left:202.5pt;margin-top:219.1pt;width:182.7pt;height:.05pt;z-index:251667456;visibility:visible;mso-wrap-style:square;mso-wrap-distance-left:9pt;mso-wrap-distance-top:0;mso-wrap-distance-right:9pt;mso-wrap-distance-bottom:0;mso-position-horizontal:absolute;mso-position-horizontal-relative:text;mso-position-vertical:absolute;mso-position-vertical-relative:text;v-text-anchor:top" o:gfxdata="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" stroked="f">
+                <v:textbox style="mso-fit-shape-to-text:t" inset="0,0,0,0">
+                  <w:txbxContent>
+                    <w:p>
+                      <w:pPr>
+                        <w:pStyle w:val="Beskrivning"/>
+                        <w:rPr>
+                          <w:rFonts w:cs="FreeSerif"/>
+                        </w:rPr>
+                      </w:pPr>
+                      <w:r>
+                        <w:t xml:space="preserve">Figur 5 – </w:t>
+                      </w:r>
+                      <w:proofErr w:type="spellStart"/>
+                      <w:r>
+                        <w:t>Mockup</w:t>
+                      </w:r>
+                      <w:proofErr w:type="spellEnd"/>
+                      <w:r>
+                        <w:t xml:space="preserve"> desktop</w:t>
+                      </w:r>
+                    </w:p>
+                  </w:txbxContent>
+                </v:textbox>
+              </v:shape>
+            </w:pict>
+          </mc:Fallback>
+        </mc:AlternateContent>
+      </w:r>
+      <w:r>
+        <w:drawing>
+          <wp:anchor distT="0" distB="0" distL="114300" distR="114300" simplePos="0" relativeHeight="251665408" behindDoc="0" locked="0" layoutInCell="1" allowOverlap="1" wp14:anchorId="31DDC8C1" wp14:editId="17A57EF1">
+            <wp:simplePos x="0" y="0"/>
+            <wp:positionH relativeFrom="margin">
+              <wp:align>right</wp:align>
+            </wp:positionH>
+            <wp:positionV relativeFrom="paragraph">
+              <wp:posOffset>1270</wp:posOffset>
+            </wp:positionV>
+            <wp:extent cx="2320290" cy="2724150"/>
+            <wp:effectExtent l="0" t="0" r="3810" b="0"/>
+            <wp:wrapNone/>
+            <wp:docPr id="656315794" name="Bildobjekt 1"/>
+            <wp:cNvGraphicFramePr>
+              <a:graphicFrameLocks xmlns:a="http://schemas.openxmlformats.org/drawingml/2006/main" noChangeAspect="1"/>
+            </wp:cNvGraphicFramePr>
+            <a:graphic xmlns:a="http://schemas.openxmlformats.org/drawingml/2006/main">
+              <a:graphicData uri="http://schemas.openxmlformats.org/drawingml/2006/picture">
+                <pic:pic xmlns:pic="http://schemas.openxmlformats.org/drawingml/2006/picture">
+                  <pic:nvPicPr>
+                    <pic:cNvPr id="656315794" name=""/>
+                    <pic:cNvPicPr/>
+                  </pic:nvPicPr>
+                  <pic:blipFill>
+                    <a:blip r:embed="rId16">
+                      <a:extLst>
+                        <a:ext uri="{28A0092B-C50C-407E-A947-70E740481C1C}">
+                          <a14:useLocalDpi xmlns:a14="http://schemas.microsoft.com/office/drawing/2010/main" val="0"/>
+                        </a:ext>
+                      </a:extLst>
+                    </a:blip>
+                    <a:stretch>
+                      <a:fillRect/>
+                    </a:stretch>
+                  </pic:blipFill>
+                  <pic:spPr>
+                    <a:xfrm>
+                      <a:off x="0" y="0"/>
+                      <a:ext cx="2320290" cy="2724150"/>
+                    </a:xfrm>
+                    <a:prstGeom prst="rect">
+                      <a:avLst/>
+                    </a:prstGeom>
+                  </pic:spPr>
+                </pic:pic>
+              </a:graphicData>
+            </a:graphic>
+            <wp14:sizeRelH relativeFrom="page">
+              <wp14:pctWidth>0</wp14:pctWidth>
+            </wp14:sizeRelH>
+            <wp14:sizeRelV relativeFrom="page">
+              <wp14:pctHeight>0</wp14:pctHeight>
+            </wp14:sizeRelV>
+          </wp:anchor>
+        </w:drawing>
+      </w:r>
+      <w:r>
+        <w:drawing>
+          <wp:inline distT="0" distB="0" distL="0" distR="0" wp14:anchorId="31C165F5" wp14:editId="304DA5EE">
+            <wp:extent cx="2327687" cy="3609975"/>
+            <wp:effectExtent l="0" t="0" r="0" b="0"/>
+            <wp:docPr id="1660897364" name="Bildobjekt 1"/>
+            <wp:cNvGraphicFramePr>
+              <a:graphicFrameLocks xmlns:a="http://schemas.openxmlformats.org/drawingml/2006/main" noChangeAspect="1"/>
+            </wp:cNvGraphicFramePr>
+            <a:graphic xmlns:a="http://schemas.openxmlformats.org/drawingml/2006/main">
+              <a:graphicData uri="http://schemas.openxmlformats.org/drawingml/2006/picture">
+                <pic:pic xmlns:pic="http://schemas.openxmlformats.org/drawingml/2006/picture">
+                  <pic:nvPicPr>
+                    <pic:cNvPr id="1660897364" name=""/>
+                    <pic:cNvPicPr/>
+                  </pic:nvPicPr>
+                  <pic:blipFill>
+                    <a:blip r:embed="rId17"/>
+                    <a:stretch>
+                      <a:fillRect/>
+                    </a:stretch>
+                  </pic:blipFill>
+                  <pic:spPr>
+                    <a:xfrm>
+                      <a:off x="0" y="0"/>
+                      <a:ext cx="2345812" cy="3638085"/>
+                    </a:xfrm>
+                    <a:prstGeom prst="rect">
+                      <a:avLst/>
+                    </a:prstGeom>
+                  </pic:spPr>
+                </pic:pic>
+              </a:graphicData>
+            </a:graphic>
+          </wp:inline>
+        </w:drawing>
+      </w:r>
+    </w:p>
+    <w:p>
+      <w:pPr>
+        <w:pStyle w:val="Beskrivning"/>
+        <w:jc w:val="left"/>
+      </w:pPr>
+      <w:r>
+        <w:t xml:space="preserve">Figur 4 – </w:t>
+      </w:r>
+      <w:proofErr w:type="spellStart"/>
+      <w:r>
+        <w:t>Mockups</w:t>
+      </w:r>
+      <w:proofErr w:type="spellEnd"/>
+      <w:r>
+        <w:t xml:space="preserve"> mobil</w:t>
+      </w:r>
+    </w:p>
+    <w:p>
+      <w:pPr>
+        <w:pStyle w:val="Beskrivning"/>
+        <w:jc w:val="left"/>
+      </w:pPr>
+    </w:p>
+    <w:p>
+      <w:pPr>
+        <w:pStyle w:val="Rubrik2"/>
+      </w:pPr>
+      <w:r>
+        <w:t>HTML</w:t>
+      </w:r>
+      <w:r>
+        <w:t xml:space="preserve"> &amp; CSS</w:t>
+      </w:r>
+    </w:p>
+    <w:p>
+      <w:pPr>
+        <w:pStyle w:val="Beskrivning"/>
+        <w:jc w:val="left"/>
+        <w:rPr>
+          <w:i w:val="0"/>
+          <w:iCs w:val="0"/>
+        </w:rPr>
+      </w:pPr>
+      <w:r>
+        <w:rPr>
+          <w:i w:val="0"/>
+          <w:iCs w:val="0"/>
+        </w:rPr>
+        <w:t>När planeringen var klar startade jag upp ett nytt projekt i Visual Studio Code</w:t>
+      </w:r>
+      <w:r>
+        <w:rPr>
+          <w:i w:val="0"/>
+          <w:iCs w:val="0"/>
+        </w:rPr>
+        <w:t xml:space="preserve"> och direkt när första filerna var skapade drog jag i</w:t>
+      </w:r>
+      <w:r>
+        <w:rPr>
+          <w:i w:val="0"/>
+          <w:iCs w:val="0"/>
+        </w:rPr>
+        <w:t xml:space="preserve"> </w:t>
+      </w:r>
+      <w:r>
+        <w:rPr>
+          <w:i w:val="0"/>
+          <w:iCs w:val="0"/>
+        </w:rPr>
+        <w:t xml:space="preserve">gång ett nytt </w:t>
+      </w:r>
+      <w:proofErr w:type="spellStart"/>
+      <w:r>
+        <w:rPr>
+          <w:i w:val="0"/>
+          <w:iCs w:val="0"/>
+        </w:rPr>
+        <w:t>repository</w:t>
+      </w:r>
+      <w:proofErr w:type="spellEnd"/>
+      <w:r>
+        <w:rPr>
+          <w:i w:val="0"/>
+          <w:iCs w:val="0"/>
+        </w:rPr>
+        <w:t xml:space="preserve"> i </w:t>
+      </w:r>
+      <w:proofErr w:type="spellStart"/>
+      <w:r>
+        <w:rPr>
+          <w:i w:val="0"/>
+          <w:iCs w:val="0"/>
+        </w:rPr>
+        <w:t>Github</w:t>
+      </w:r>
+      <w:proofErr w:type="spellEnd"/>
+      <w:r>
+        <w:rPr>
+          <w:i w:val="0"/>
+          <w:iCs w:val="0"/>
+        </w:rPr>
+        <w:t xml:space="preserve"> för att komma i gång med versionshanteringen.</w:t>
+      </w:r>
+    </w:p>
+    <w:p>
+      <w:pPr>
+        <w:pStyle w:val="Beskrivning"/>
+        <w:rPr>
+          <w:i w:val="0"/>
+          <w:iCs w:val="0"/>
+        </w:rPr>
+      </w:pPr>
+      <w:r>
+        <w:rPr>
+          <w:i w:val="0"/>
+          <w:iCs w:val="0"/>
+        </w:rPr>
+        <w:t xml:space="preserve">Jag började arbeta med startsidans element och sedan lade jag till </w:t>
+      </w:r>
+      <w:proofErr w:type="spellStart"/>
+      <w:r>
+        <w:rPr>
+          <w:i w:val="0"/>
+          <w:iCs w:val="0"/>
+        </w:rPr>
+        <w:t>css</w:t>
+      </w:r>
+      <w:proofErr w:type="spellEnd"/>
+      <w:r>
+        <w:rPr>
+          <w:i w:val="0"/>
+          <w:iCs w:val="0"/>
+        </w:rPr>
+        <w:t>.</w:t>
+      </w:r>
+      <w:r>
+        <w:rPr>
+          <w:i w:val="0"/>
+          <w:iCs w:val="0"/>
+        </w:rPr>
+        <w:t xml:space="preserve"> Jag valde att positionera menyn med CSS </w:t>
+      </w:r>
+      <w:proofErr w:type="spellStart"/>
+      <w:r>
+        <w:rPr>
+          <w:i w:val="0"/>
+          <w:iCs w:val="0"/>
+        </w:rPr>
+        <w:t>Flexbox</w:t>
+      </w:r>
+      <w:proofErr w:type="spellEnd"/>
+      <w:r>
+        <w:rPr>
+          <w:i w:val="0"/>
+          <w:iCs w:val="0"/>
+        </w:rPr>
+        <w:t xml:space="preserve"> för att få länkarna i menyn att flöda horisontellt på större skärm. För att få till denna </w:t>
+      </w:r>
+      <w:proofErr w:type="spellStart"/>
+      <w:r>
+        <w:rPr>
+          <w:i w:val="0"/>
+          <w:iCs w:val="0"/>
+        </w:rPr>
+        <w:t>responsivitet</w:t>
+      </w:r>
+      <w:proofErr w:type="spellEnd"/>
+      <w:r>
+        <w:rPr>
+          <w:i w:val="0"/>
+          <w:iCs w:val="0"/>
+        </w:rPr>
+        <w:t xml:space="preserve"> använde jag media </w:t>
+      </w:r>
+      <w:proofErr w:type="spellStart"/>
+      <w:r>
+        <w:rPr>
+          <w:i w:val="0"/>
+          <w:iCs w:val="0"/>
+        </w:rPr>
+        <w:t>querys</w:t>
+      </w:r>
+      <w:proofErr w:type="spellEnd"/>
+      <w:r>
+        <w:rPr>
+          <w:i w:val="0"/>
+          <w:iCs w:val="0"/>
+        </w:rPr>
+        <w:t xml:space="preserve"> som lägger till </w:t>
+      </w:r>
+      <w:proofErr w:type="spellStart"/>
+      <w:r>
+        <w:rPr>
+          <w:i w:val="0"/>
+          <w:iCs w:val="0"/>
+        </w:rPr>
+        <w:t>f</w:t>
+      </w:r>
+      <w:r>
+        <w:rPr>
+          <w:i w:val="0"/>
+          <w:iCs w:val="0"/>
+        </w:rPr>
+        <w:t>lexbox</w:t>
+      </w:r>
+      <w:proofErr w:type="spellEnd"/>
+      <w:r>
+        <w:rPr>
+          <w:i w:val="0"/>
+          <w:iCs w:val="0"/>
+        </w:rPr>
+        <w:t xml:space="preserve"> vid skärmstorlek större än </w:t>
+      </w:r>
+      <w:r>
+        <w:rPr>
+          <w:i w:val="0"/>
+          <w:iCs w:val="0"/>
+        </w:rPr>
+        <w:t xml:space="preserve">750 </w:t>
+      </w:r>
+      <w:proofErr w:type="spellStart"/>
+      <w:r>
+        <w:rPr>
+          <w:i w:val="0"/>
+          <w:iCs w:val="0"/>
+        </w:rPr>
+        <w:t>px</w:t>
+      </w:r>
+      <w:proofErr w:type="spellEnd"/>
+      <w:r>
+        <w:rPr>
+          <w:i w:val="0"/>
+          <w:iCs w:val="0"/>
+        </w:rPr>
+        <w:t>.</w:t>
+      </w:r>
+      <w:r>
+        <w:rPr>
+          <w:i w:val="0"/>
+          <w:iCs w:val="0"/>
+        </w:rPr>
+        <w:t xml:space="preserve"> </w:t>
+      </w:r>
+    </w:p>
+    <w:p>
+      <w:pPr>
+        <w:pStyle w:val="Beskrivning"/>
+        <w:rPr>
+          <w:i w:val="0"/>
+          <w:iCs w:val="0"/>
+        </w:rPr>
+      </w:pPr>
+      <w:r>
+        <w:rPr>
+          <w:i w:val="0"/>
+          <w:iCs w:val="0"/>
+        </w:rPr>
+        <w:t xml:space="preserve">Bakgrundsbilden på min </w:t>
+      </w:r>
+      <w:proofErr w:type="spellStart"/>
+      <w:r>
+        <w:rPr>
+          <w:i w:val="0"/>
+          <w:iCs w:val="0"/>
+        </w:rPr>
+        <w:t>hero</w:t>
+      </w:r>
+      <w:proofErr w:type="spellEnd"/>
+      <w:r>
+        <w:rPr>
+          <w:i w:val="0"/>
+          <w:iCs w:val="0"/>
+        </w:rPr>
+        <w:t>-sektion</w:t>
+      </w:r>
+      <w:r>
+        <w:rPr>
+          <w:i w:val="0"/>
+          <w:iCs w:val="0"/>
+        </w:rPr>
+        <w:t xml:space="preserve"> skulle </w:t>
+      </w:r>
+      <w:r>
+        <w:rPr>
+          <w:i w:val="0"/>
+          <w:iCs w:val="0"/>
+        </w:rPr>
+        <w:t>ha en nedtonad färg</w:t>
+      </w:r>
+      <w:r>
+        <w:rPr>
+          <w:i w:val="0"/>
+          <w:iCs w:val="0"/>
+        </w:rPr>
+        <w:t xml:space="preserve"> och för att inte även logga och text skulle bli genomskinliga</w:t>
+      </w:r>
+      <w:r>
+        <w:rPr>
+          <w:i w:val="0"/>
+          <w:iCs w:val="0"/>
+        </w:rPr>
+        <w:t>, vilket var resultatet när jag satte genomskinlighet (</w:t>
+      </w:r>
+      <w:proofErr w:type="spellStart"/>
+      <w:r>
+        <w:rPr>
+          <w:i w:val="0"/>
+          <w:iCs w:val="0"/>
+        </w:rPr>
+        <w:t>opacity</w:t>
+      </w:r>
+      <w:proofErr w:type="spellEnd"/>
+      <w:r>
+        <w:rPr>
+          <w:i w:val="0"/>
+          <w:iCs w:val="0"/>
+        </w:rPr>
+        <w:t>)</w:t>
+      </w:r>
+      <w:r>
+        <w:rPr>
+          <w:i w:val="0"/>
+          <w:iCs w:val="0"/>
+        </w:rPr>
+        <w:t xml:space="preserve"> löste jag det </w:t>
+      </w:r>
+      <w:r>
+        <w:rPr>
+          <w:i w:val="0"/>
+          <w:iCs w:val="0"/>
+        </w:rPr>
+        <w:t xml:space="preserve">först </w:t>
+      </w:r>
+      <w:r>
+        <w:rPr>
+          <w:i w:val="0"/>
+          <w:iCs w:val="0"/>
+        </w:rPr>
+        <w:t xml:space="preserve">genom att lägga en genomskinlig ljusgrå </w:t>
+      </w:r>
+      <w:r>
+        <w:rPr>
+          <w:i w:val="0"/>
+          <w:iCs w:val="0"/>
+        </w:rPr>
+        <w:t>div-</w:t>
+      </w:r>
+      <w:r>
+        <w:rPr>
+          <w:i w:val="0"/>
+          <w:iCs w:val="0"/>
+        </w:rPr>
+        <w:t>platta på bakgrunden.</w:t>
+      </w:r>
+      <w:r>
+        <w:rPr>
+          <w:i w:val="0"/>
+          <w:iCs w:val="0"/>
+        </w:rPr>
+        <w:t xml:space="preserve"> Sedan hittade jag en ännu bättre lösning. Genom att lägga både bakgrundsbild och bakgrundsfärg med RGB-genomskinlighet på </w:t>
+      </w:r>
+      <w:r>
+        <w:rPr>
+          <w:i w:val="0"/>
+          <w:iCs w:val="0"/>
+        </w:rPr>
+        <w:t>elementet</w:t>
+      </w:r>
+      <w:r>
+        <w:rPr>
+          <w:i w:val="0"/>
+          <w:iCs w:val="0"/>
+        </w:rPr>
+        <w:t xml:space="preserve"> och sedan blanda dessa med </w:t>
+      </w:r>
+      <w:proofErr w:type="spellStart"/>
+      <w:r>
+        <w:t>background</w:t>
+      </w:r>
+      <w:proofErr w:type="spellEnd"/>
+      <w:r>
+        <w:t>-</w:t>
+      </w:r>
+      <w:proofErr w:type="spellStart"/>
+      <w:r>
+        <w:t>blend</w:t>
+      </w:r>
+      <w:proofErr w:type="spellEnd"/>
+      <w:r>
+        <w:t xml:space="preserve">-mode: </w:t>
+      </w:r>
+      <w:proofErr w:type="spellStart"/>
+      <w:r>
+        <w:t>lighten</w:t>
+      </w:r>
+      <w:proofErr w:type="spellEnd"/>
+      <w:r>
+        <w:t>;</w:t>
+      </w:r>
+      <w:r>
+        <w:t xml:space="preserve"> </w:t>
+      </w:r>
+      <w:r>
+        <w:rPr>
+          <w:i w:val="0"/>
+          <w:iCs w:val="0"/>
+        </w:rPr>
+        <w:t xml:space="preserve">så behövdes inte längre en extra </w:t>
+      </w:r>
+      <w:r>
+        <w:rPr>
+          <w:i w:val="0"/>
+          <w:iCs w:val="0"/>
+        </w:rPr>
+        <w:t>div-</w:t>
+      </w:r>
+      <w:r>
+        <w:rPr>
+          <w:i w:val="0"/>
+          <w:iCs w:val="0"/>
+        </w:rPr>
+        <w:t>platta! (</w:t>
+      </w:r>
+      <w:hyperlink r:id="rId18" w:history="1">
+        <w:r>
+          <w:rPr>
+            <w:rStyle w:val="Hyperlnk"/>
+            <w:i w:val="0"/>
+            <w:iCs w:val="0"/>
+          </w:rPr>
+          <w:t>https://radu.link/change-background-image-opacity-css/</w:t>
+        </w:r>
+      </w:hyperlink>
+      <w:r>
+        <w:rPr>
+          <w:i w:val="0"/>
+          <w:iCs w:val="0"/>
+        </w:rPr>
+        <w:t>)</w:t>
+      </w:r>
+    </w:p>
+    <w:p>
+      <w:pPr>
+        <w:pStyle w:val="Beskrivning"/>
+        <w:rPr>
+          <w:i w:val="0"/>
+          <w:iCs w:val="0"/>
+        </w:rPr>
+      </w:pPr>
+    </w:p>
+    <w:p>
+      <w:pPr>
+        <w:pStyle w:val="Beskrivning"/>
+        <w:rPr>
+          <w:i w:val="0"/>
+          <w:iCs w:val="0"/>
+        </w:rPr>
+      </w:pPr>
+      <w:r>
+        <w:rPr>
+          <w:noProof/>
+        </w:rPr>
+        <mc:AlternateContent>
+          <mc:Choice Requires="wps">
+            <w:drawing>
+              <wp:anchor distT="0" distB="0" distL="114300" distR="114300" simplePos="0" relativeHeight="251671552" behindDoc="0" locked="0" layoutInCell="1" allowOverlap="1" wp14:anchorId="4597EB79" wp14:editId="367ED6E2">
+                <wp:simplePos x="0" y="0"/>
+                <wp:positionH relativeFrom="margin">
+                  <wp:posOffset>3220720</wp:posOffset>
+                </wp:positionH>
+                <wp:positionV relativeFrom="paragraph">
+                  <wp:posOffset>528320</wp:posOffset>
+                </wp:positionV>
+                <wp:extent cx="1642110" cy="635"/>
+                <wp:effectExtent l="0" t="0" r="0" b="0"/>
+                <wp:wrapSquare wrapText="bothSides"/>
+                <wp:docPr id="1087542569" name="Textruta 1"/>
+                <wp:cNvGraphicFramePr/>
+                <a:graphic xmlns:a="http://schemas.openxmlformats.org/drawingml/2006/main">
+                  <a:graphicData uri="http://schemas.microsoft.com/office/word/2010/wordprocessingShape">
+                    <wps:wsp>
+                      <wps:cNvSpPr txBox="1"/>
+                      <wps:spPr>
+                        <a:xfrm>
+                          <a:off x="0" y="0"/>
+                          <a:ext cx="1642110" cy="635"/>
+                        </a:xfrm>
+                        <a:prstGeom prst="rect">
+                          <a:avLst/>
+                        </a:prstGeom>
+                        <a:solidFill>
+                          <a:prstClr val="white"/>
+                        </a:solidFill>
+                        <a:ln>
+                          <a:noFill/>
+                        </a:ln>
+                      </wps:spPr>
+                      <wps:txbx>
+                        <w:txbxContent>
+                          <w:p>
+                            <w:pPr>
+                              <w:pStyle w:val="Beskrivning"/>
+                            </w:pPr>
+                            <w:r>
+                              <w:t xml:space="preserve">Figur 6 </w:t>
+                            </w:r>
+                            <w:r>
+                              <w:t>–</w:t>
+                            </w:r>
+                            <w:r>
+                              <w:t xml:space="preserve"> </w:t>
+                            </w:r>
+                            <w:r>
+                              <w:t xml:space="preserve">HTML </w:t>
+                            </w:r>
+                            <w:proofErr w:type="spellStart"/>
+                            <w:r>
+                              <w:t>hero</w:t>
+                            </w:r>
+                            <w:proofErr w:type="spellEnd"/>
+                          </w:p>
+                        </w:txbxContent>
+                      </wps:txbx>
+                      <wps:bodyPr rot="0" spcFirstLastPara="0" vertOverflow="overflow" horzOverflow="overflow" vert="horz" wrap="square" lIns="0" tIns="0" rIns="0" bIns="0" numCol="1" spcCol="0" rtlCol="0" fromWordArt="0" anchor="t" anchorCtr="0" forceAA="0" compatLnSpc="1">
+                        <a:prstTxWarp prst="textNoShape">
+                          <a:avLst/>
+                        </a:prstTxWarp>
+                        <a:spAutoFit/>
+                      </wps:bodyPr>
+                    </wps:wsp>
+                  </a:graphicData>
+                </a:graphic>
+                <wp14:sizeRelH relativeFrom="margin">
+                  <wp14:pctWidth>0</wp14:pctWidth>
+                </wp14:sizeRelH>
+              </wp:anchor>
+            </w:drawing>
+          </mc:Choice>
+          <mc:Fallback>
+            <w:pict>
+              <v:shape w14:anchorId="4597EB79" id="_x0000_s1029" type="#_x0000_t202" style="position:absolute;left:0;text-align:left;margin-left:253.6pt;margin-top:41.6pt;width:129.3pt;height:.05pt;z-index:251671552;visibility:visible;mso-wrap-style:square;mso-width-percent:0;mso-wrap-distance-left:9pt;mso-wrap-distance-top:0;mso-wrap-distance-right:9pt;mso-wrap-distance-bottom:0;mso-position-horizontal:absolute;mso-position-horizontal-relative:margin;mso-position-vertical:absolute;mso-position-vertical-relative:text;mso-width-percent:0;mso-width-relative:margin;v-text-anchor:top" o:gfxdata="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" stroked="f">
+                <v:textbox style="mso-fit-shape-to-text:t" inset="0,0,0,0">
+                  <w:txbxContent>
+                    <w:p>
+                      <w:pPr>
+                        <w:pStyle w:val="Beskrivning"/>
+                      </w:pPr>
+                      <w:r>
+                        <w:t xml:space="preserve">Figur 6 </w:t>
+                      </w:r>
+                      <w:r>
+                        <w:t>–</w:t>
+                      </w:r>
+                      <w:r>
+                        <w:t xml:space="preserve"> </w:t>
+                      </w:r>
+                      <w:r>
+                        <w:t xml:space="preserve">HTML </w:t>
+                      </w:r>
+                      <w:proofErr w:type="spellStart"/>
+                      <w:r>
+                        <w:t>hero</w:t>
+                      </w:r>
+                      <w:proofErr w:type="spellEnd"/>
+                    </w:p>
+                  </w:txbxContent>
+                </v:textbox>
+                <w10:wrap type="square" anchorx="margin"/>
+              </v:shape>
+            </w:pict>
+          </mc:Fallback>
+        </mc:AlternateContent>
+      </w:r>
+      <w:r>
+        <w:rPr>
+          <w:i w:val="0"/>
+          <w:iCs w:val="0"/>
+        </w:rPr>
+        <w:drawing>
+          <wp:inline distT="0" distB="0" distL="0" distR="0" wp14:anchorId="74D6B607" wp14:editId="61A23C89">
+            <wp:extent cx="3041650" cy="865240"/>
+            <wp:effectExtent l="0" t="0" r="6350" b="0"/>
+            <wp:docPr id="661795523" name="Bildobjekt 1"/>
+            <wp:cNvGraphicFramePr>
+              <a:graphicFrameLocks xmlns:a="http://schemas.openxmlformats.org/drawingml/2006/main" noChangeAspect="1"/>
+            </wp:cNvGraphicFramePr>
+            <a:graphic xmlns:a="http://schemas.openxmlformats.org/drawingml/2006/main">
+              <a:graphicData uri="http://schemas.openxmlformats.org/drawingml/2006/picture">
+                <pic:pic xmlns:pic="http://schemas.openxmlformats.org/drawingml/2006/picture">
+                  <pic:nvPicPr>
+                    <pic:cNvPr id="661795523" name=""/>
+                    <pic:cNvPicPr/>
+                  </pic:nvPicPr>
+                  <pic:blipFill>
+                    <a:blip r:embed="rId19" cstate="print">
+                      <a:extLst>
+                        <a:ext uri="{28A0092B-C50C-407E-A947-70E740481C1C}">
+                          <a14:useLocalDpi xmlns:a14="http://schemas.microsoft.com/office/drawing/2010/main" val="0"/>
+                        </a:ext>
+                      </a:extLst>
+                    </a:blip>
+                    <a:stretch>
+                      <a:fillRect/>
+                    </a:stretch>
+                  </pic:blipFill>
+                  <pic:spPr>
+                    <a:xfrm>
+                      <a:off x="0" y="0"/>
+                      <a:ext cx="3062379" cy="871137"/>
+                    </a:xfrm>
+                    <a:prstGeom prst="rect">
+                      <a:avLst/>
+                    </a:prstGeom>
+                  </pic:spPr>
+                </pic:pic>
+              </a:graphicData>
+            </a:graphic>
+          </wp:inline>
+        </w:drawing>
+      </w:r>
+    </w:p>
+    <w:p>
+      <w:pPr>
+        <w:pStyle w:val="Beskrivning"/>
+        <w:rPr>
+          <w:i w:val="0"/>
+          <w:iCs w:val="0"/>
+        </w:rPr>
+      </w:pPr>
+      <w:r>
+        <w:rPr>
+          <w:noProof/>
+        </w:rPr>
+        <w:lastRenderedPageBreak/>
+        <mc:AlternateContent>
+          <mc:Choice Requires="wps">
+            <w:drawing>
+              <wp:anchor distT="0" distB="0" distL="114300" distR="114300" simplePos="0" relativeHeight="251673600" behindDoc="0" locked="0" layoutInCell="1" allowOverlap="1" wp14:anchorId="108853E9" wp14:editId="247FC8F5">
+                <wp:simplePos x="0" y="0"/>
+                <wp:positionH relativeFrom="margin">
+                  <wp:posOffset>3227070</wp:posOffset>
+                </wp:positionH>
+                <wp:positionV relativeFrom="paragraph">
+                  <wp:posOffset>1887220</wp:posOffset>
+                </wp:positionV>
+                <wp:extent cx="1358900" cy="635"/>
+                <wp:effectExtent l="0" t="0" r="0" b="0"/>
+                <wp:wrapSquare wrapText="bothSides"/>
+                <wp:docPr id="1020127198" name="Textruta 1"/>
+                <wp:cNvGraphicFramePr/>
+                <a:graphic xmlns:a="http://schemas.openxmlformats.org/drawingml/2006/main">
+                  <a:graphicData uri="http://schemas.microsoft.com/office/word/2010/wordprocessingShape">
+                    <wps:wsp>
+                      <wps:cNvSpPr txBox="1"/>
+                      <wps:spPr>
+                        <a:xfrm>
+                          <a:off x="0" y="0"/>
+                          <a:ext cx="1358900" cy="635"/>
+                        </a:xfrm>
+                        <a:prstGeom prst="rect">
+                          <a:avLst/>
+                        </a:prstGeom>
+                        <a:solidFill>
+                          <a:prstClr val="white"/>
+                        </a:solidFill>
+                        <a:ln>
+                          <a:noFill/>
+                        </a:ln>
+                      </wps:spPr>
+                      <wps:txbx>
+                        <w:txbxContent>
+                          <w:p>
+                            <w:pPr>
+                              <w:pStyle w:val="Beskrivning"/>
+                            </w:pPr>
+                            <w:r>
+                              <w:t xml:space="preserve">Figur 7 – CSS </w:t>
+                            </w:r>
+                            <w:proofErr w:type="spellStart"/>
+                            <w:r>
+                              <w:t>hero</w:t>
+                            </w:r>
+                            <w:proofErr w:type="spellEnd"/>
+                          </w:p>
+                        </w:txbxContent>
+                      </wps:txbx>
+                      <wps:bodyPr rot="0" spcFirstLastPara="0" vertOverflow="overflow" horzOverflow="overflow" vert="horz" wrap="square" lIns="0" tIns="0" rIns="0" bIns="0" numCol="1" spcCol="0" rtlCol="0" fromWordArt="0" anchor="t" anchorCtr="0" forceAA="0" compatLnSpc="1">
+                        <a:prstTxWarp prst="textNoShape">
+                          <a:avLst/>
+                        </a:prstTxWarp>
+                        <a:spAutoFit/>
+                      </wps:bodyPr>
+                    </wps:wsp>
+                  </a:graphicData>
+                </a:graphic>
+                <wp14:sizeRelH relativeFrom="margin">
+                  <wp14:pctWidth>0</wp14:pctWidth>
+                </wp14:sizeRelH>
+              </wp:anchor>
+            </w:drawing>
+          </mc:Choice>
+          <mc:Fallback>
+            <w:pict>
+              <v:shape w14:anchorId="108853E9" id="_x0000_s1030" type="#_x0000_t202" style="position:absolute;left:0;text-align:left;margin-left:254.1pt;margin-top:148.6pt;width:107pt;height:.05pt;z-index:251673600;visibility:visible;mso-wrap-style:square;mso-width-percent:0;mso-wrap-distance-left:9pt;mso-wrap-distance-top:0;mso-wrap-distance-right:9pt;mso-wrap-distance-bottom:0;mso-position-horizontal:absolute;mso-position-horizontal-relative:margin;mso-position-vertical:absolute;mso-position-vertical-relative:text;mso-width-percent:0;mso-width-relative:margin;v-text-anchor:top" o:gfxdata="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" stroked="f">
+                <v:textbox style="mso-fit-shape-to-text:t" inset="0,0,0,0">
+                  <w:txbxContent>
+                    <w:p>
+                      <w:pPr>
+                        <w:pStyle w:val="Beskrivning"/>
+                      </w:pPr>
+                      <w:r>
+                        <w:t xml:space="preserve">Figur 7 – CSS </w:t>
+                      </w:r>
+                      <w:proofErr w:type="spellStart"/>
+                      <w:r>
+                        <w:t>hero</w:t>
+                      </w:r>
+                      <w:proofErr w:type="spellEnd"/>
+                    </w:p>
+                  </w:txbxContent>
+                </v:textbox>
+                <w10:wrap type="square" anchorx="margin"/>
+              </v:shape>
+            </w:pict>
+          </mc:Fallback>
+        </mc:AlternateContent>
+      </w:r>
+      <w:r>
+        <w:rPr>
+          <w:noProof/>
+        </w:rPr>
+        <w:t xml:space="preserve"> </w:t>
+      </w:r>
+      <w:r>
+        <w:rPr>
+          <w:i w:val="0"/>
+          <w:iCs w:val="0"/>
+        </w:rPr>
+        <w:drawing>
+          <wp:inline distT="0" distB="0" distL="0" distR="0" wp14:anchorId="4934D481" wp14:editId="7A46DC44">
+            <wp:extent cx="3019905" cy="2247900"/>
+            <wp:effectExtent l="0" t="0" r="9525" b="0"/>
+            <wp:docPr id="336630028" name="Bildobjekt 1"/>
+            <wp:cNvGraphicFramePr>
+              <a:graphicFrameLocks xmlns:a="http://schemas.openxmlformats.org/drawingml/2006/main" noChangeAspect="1"/>
+            </wp:cNvGraphicFramePr>
+            <a:graphic xmlns:a="http://schemas.openxmlformats.org/drawingml/2006/main">
+              <a:graphicData uri="http://schemas.openxmlformats.org/drawingml/2006/picture">
+                <pic:pic xmlns:pic="http://schemas.openxmlformats.org/drawingml/2006/picture">
+                  <pic:nvPicPr>
+                    <pic:cNvPr id="336630028" name=""/>
+                    <pic:cNvPicPr/>
+                  </pic:nvPicPr>
+                  <pic:blipFill>
+                    <a:blip r:embed="rId20"/>
+                    <a:stretch>
+                      <a:fillRect/>
+                    </a:stretch>
+                  </pic:blipFill>
+                  <pic:spPr>
+                    <a:xfrm>
+                      <a:off x="0" y="0"/>
+                      <a:ext cx="3028859" cy="2254565"/>
+                    </a:xfrm>
+                    <a:prstGeom prst="rect">
+                      <a:avLst/>
+                    </a:prstGeom>
+                  </pic:spPr>
+                </pic:pic>
+              </a:graphicData>
+            </a:graphic>
+          </wp:inline>
+        </w:drawing>
+      </w:r>
+    </w:p>
+    <w:p>
+      <w:pPr>
+        <w:pStyle w:val="Beskrivning"/>
+        <w:rPr>
+          <w:i w:val="0"/>
+          <w:iCs w:val="0"/>
+        </w:rPr>
+      </w:pPr>
+    </w:p>
+    <w:p>
+      <w:pPr>
+        <w:pStyle w:val="Beskrivning"/>
+        <w:rPr>
+          <w:i w:val="0"/>
+          <w:iCs w:val="0"/>
+        </w:rPr>
+      </w:pPr>
+      <w:r>
+        <w:rPr>
+          <w:i w:val="0"/>
+          <w:iCs w:val="0"/>
+        </w:rPr>
+        <w:drawing>
+          <wp:anchor distT="0" distB="0" distL="114300" distR="114300" simplePos="0" relativeHeight="251677696" behindDoc="0" locked="0" layoutInCell="1" allowOverlap="1" wp14:anchorId="4D292562" wp14:editId="2A7A874B">
+            <wp:simplePos x="0" y="0"/>
+            <wp:positionH relativeFrom="margin">
+              <wp:posOffset>1872615</wp:posOffset>
+            </wp:positionH>
+            <wp:positionV relativeFrom="paragraph">
+              <wp:posOffset>3264535</wp:posOffset>
+            </wp:positionV>
+            <wp:extent cx="3036319" cy="1123950"/>
+            <wp:effectExtent l="0" t="0" r="0" b="0"/>
+            <wp:wrapSquare wrapText="bothSides"/>
+            <wp:docPr id="270342551" name="Bildobjekt 1"/>
+            <wp:cNvGraphicFramePr>
+              <a:graphicFrameLocks xmlns:a="http://schemas.openxmlformats.org/drawingml/2006/main" noChangeAspect="1"/>
+            </wp:cNvGraphicFramePr>
+            <a:graphic xmlns:a="http://schemas.openxmlformats.org/drawingml/2006/main">
+              <a:graphicData uri="http://schemas.openxmlformats.org/drawingml/2006/picture">
+                <pic:pic xmlns:pic="http://schemas.openxmlformats.org/drawingml/2006/picture">
+                  <pic:nvPicPr>
+                    <pic:cNvPr id="270342551" name=""/>
+                    <pic:cNvPicPr/>
+                  </pic:nvPicPr>
+                  <pic:blipFill>
+                    <a:blip r:embed="rId21" cstate="print">
+                      <a:extLst>
+                        <a:ext uri="{28A0092B-C50C-407E-A947-70E740481C1C}">
+                          <a14:useLocalDpi xmlns:a14="http://schemas.microsoft.com/office/drawing/2010/main" val="0"/>
+                        </a:ext>
+                      </a:extLst>
+                    </a:blip>
+                    <a:stretch>
+                      <a:fillRect/>
+                    </a:stretch>
+                  </pic:blipFill>
+                  <pic:spPr>
+                    <a:xfrm>
+                      <a:off x="0" y="0"/>
+                      <a:ext cx="3036319" cy="1123950"/>
+                    </a:xfrm>
+                    <a:prstGeom prst="rect">
+                      <a:avLst/>
+                    </a:prstGeom>
+                  </pic:spPr>
+                </pic:pic>
+              </a:graphicData>
+            </a:graphic>
+            <wp14:sizeRelH relativeFrom="page">
+              <wp14:pctWidth>0</wp14:pctWidth>
+            </wp14:sizeRelH>
+            <wp14:sizeRelV relativeFrom="page">
+              <wp14:pctHeight>0</wp14:pctHeight>
+            </wp14:sizeRelV>
+          </wp:anchor>
+        </w:drawing>
+      </w:r>
+      <w:r>
+        <w:rPr>
+          <w:i w:val="0"/>
+          <w:iCs w:val="0"/>
+        </w:rPr>
+        <w:drawing>
+          <wp:anchor distT="0" distB="0" distL="114300" distR="114300" simplePos="0" relativeHeight="251676672" behindDoc="0" locked="0" layoutInCell="1" allowOverlap="1" wp14:anchorId="2ED530C4" wp14:editId="6A980270">
+            <wp:simplePos x="0" y="0"/>
+            <wp:positionH relativeFrom="margin">
+              <wp:posOffset>0</wp:posOffset>
+            </wp:positionH>
+            <wp:positionV relativeFrom="paragraph">
+              <wp:posOffset>2038985</wp:posOffset>
+            </wp:positionV>
+            <wp:extent cx="1797592" cy="2355850"/>
+            <wp:effectExtent l="0" t="0" r="0" b="6350"/>
+            <wp:wrapSquare wrapText="bothSides"/>
+            <wp:docPr id="723668489" name="Bildobjekt 1"/>
+            <wp:cNvGraphicFramePr>
+              <a:graphicFrameLocks xmlns:a="http://schemas.openxmlformats.org/drawingml/2006/main" noChangeAspect="1"/>
+            </wp:cNvGraphicFramePr>
+            <a:graphic xmlns:a="http://schemas.openxmlformats.org/drawingml/2006/main">
+              <a:graphicData uri="http://schemas.openxmlformats.org/drawingml/2006/picture">
+                <pic:pic xmlns:pic="http://schemas.openxmlformats.org/drawingml/2006/picture">
+                  <pic:nvPicPr>
+                    <pic:cNvPr id="723668489" name=""/>
+                    <pic:cNvPicPr/>
+                  </pic:nvPicPr>
+                  <pic:blipFill>
+                    <a:blip r:embed="rId22" cstate="print">
+                      <a:extLst>
+                        <a:ext uri="{28A0092B-C50C-407E-A947-70E740481C1C}">
+                          <a14:useLocalDpi xmlns:a14="http://schemas.microsoft.com/office/drawing/2010/main" val="0"/>
+                        </a:ext>
+                      </a:extLst>
+                    </a:blip>
+                    <a:stretch>
+                      <a:fillRect/>
+                    </a:stretch>
+                  </pic:blipFill>
+                  <pic:spPr>
+                    <a:xfrm>
+                      <a:off x="0" y="0"/>
+                      <a:ext cx="1797592" cy="2355850"/>
+                    </a:xfrm>
+                    <a:prstGeom prst="rect">
+                      <a:avLst/>
+                    </a:prstGeom>
+                  </pic:spPr>
+                </pic:pic>
+              </a:graphicData>
+            </a:graphic>
+            <wp14:sizeRelH relativeFrom="page">
+              <wp14:pctWidth>0</wp14:pctWidth>
+            </wp14:sizeRelH>
+            <wp14:sizeRelV relativeFrom="page">
+              <wp14:pctHeight>0</wp14:pctHeight>
+            </wp14:sizeRelV>
+          </wp:anchor>
+        </w:drawing>
+      </w:r>
+      <w:r>
+        <w:rPr>
+          <w:i w:val="0"/>
+          <w:iCs w:val="0"/>
+        </w:rPr>
+        <w:drawing>
+          <wp:anchor distT="0" distB="0" distL="114300" distR="114300" simplePos="0" relativeHeight="251675648" behindDoc="0" locked="0" layoutInCell="1" allowOverlap="1" wp14:anchorId="3EF4331A" wp14:editId="65759312">
+            <wp:simplePos x="0" y="0"/>
+            <wp:positionH relativeFrom="column">
+              <wp:posOffset>1874520</wp:posOffset>
+            </wp:positionH>
+            <wp:positionV relativeFrom="paragraph">
+              <wp:posOffset>2038985</wp:posOffset>
+            </wp:positionV>
+            <wp:extent cx="3042173" cy="1225550"/>
+            <wp:effectExtent l="0" t="0" r="6350" b="0"/>
+            <wp:wrapSquare wrapText="bothSides"/>
+            <wp:docPr id="1898436384" name="Bildobjekt 1"/>
+            <wp:cNvGraphicFramePr>
+              <a:graphicFrameLocks xmlns:a="http://schemas.openxmlformats.org/drawingml/2006/main" noChangeAspect="1"/>
+            </wp:cNvGraphicFramePr>
+            <a:graphic xmlns:a="http://schemas.openxmlformats.org/drawingml/2006/main">
+              <a:graphicData uri="http://schemas.openxmlformats.org/drawingml/2006/picture">
+                <pic:pic xmlns:pic="http://schemas.openxmlformats.org/drawingml/2006/picture">
+                  <pic:nvPicPr>
+                    <pic:cNvPr id="1898436384" name=""/>
+                    <pic:cNvPicPr/>
+                  </pic:nvPicPr>
+                  <pic:blipFill>
+                    <a:blip r:embed="rId23" cstate="print">
+                      <a:extLst>
+                        <a:ext uri="{28A0092B-C50C-407E-A947-70E740481C1C}">
+                          <a14:useLocalDpi xmlns:a14="http://schemas.microsoft.com/office/drawing/2010/main" val="0"/>
+                        </a:ext>
+                      </a:extLst>
+                    </a:blip>
+                    <a:stretch>
+                      <a:fillRect/>
+                    </a:stretch>
+                  </pic:blipFill>
+                  <pic:spPr>
+                    <a:xfrm>
+                      <a:off x="0" y="0"/>
+                      <a:ext cx="3042173" cy="1225550"/>
+                    </a:xfrm>
+                    <a:prstGeom prst="rect">
+                      <a:avLst/>
+                    </a:prstGeom>
+                  </pic:spPr>
+                </pic:pic>
+              </a:graphicData>
+            </a:graphic>
+            <wp14:sizeRelH relativeFrom="page">
+              <wp14:pctWidth>0</wp14:pctWidth>
+            </wp14:sizeRelH>
+            <wp14:sizeRelV relativeFrom="page">
+              <wp14:pctHeight>0</wp14:pctHeight>
+            </wp14:sizeRelV>
+          </wp:anchor>
+        </w:drawing>
+      </w:r>
+      <w:r>
+        <w:rPr>
+          <w:i w:val="0"/>
+          <w:iCs w:val="0"/>
+        </w:rPr>
+        <w:t xml:space="preserve">Sektionen sortiment på startsidan ligger också på en genomskinlig bakgrund så det löste jag lika som på </w:t>
+      </w:r>
+      <w:proofErr w:type="spellStart"/>
+      <w:r>
+        <w:rPr>
+          <w:i w:val="0"/>
+          <w:iCs w:val="0"/>
+        </w:rPr>
+        <w:t>hero</w:t>
+      </w:r>
+      <w:proofErr w:type="spellEnd"/>
+      <w:r>
+        <w:rPr>
+          <w:i w:val="0"/>
+          <w:iCs w:val="0"/>
+        </w:rPr>
+        <w:t xml:space="preserve">-sektionen. Sedan ville jag att sortiment-sektionen skulle ändra utseende två gånger när skärmen blev större. Det löste jag genom att lägga två tomma element, ett före och ett efter. Med en media </w:t>
+      </w:r>
+      <w:proofErr w:type="spellStart"/>
+      <w:r>
+        <w:rPr>
+          <w:i w:val="0"/>
+          <w:iCs w:val="0"/>
+        </w:rPr>
+        <w:t>query</w:t>
+      </w:r>
+      <w:proofErr w:type="spellEnd"/>
+      <w:r>
+        <w:rPr>
+          <w:i w:val="0"/>
+          <w:iCs w:val="0"/>
+        </w:rPr>
+        <w:t xml:space="preserve"> på minsta skärmstorlek 750 </w:t>
+      </w:r>
+      <w:proofErr w:type="spellStart"/>
+      <w:r>
+        <w:rPr>
+          <w:i w:val="0"/>
+          <w:iCs w:val="0"/>
+        </w:rPr>
+        <w:t>px</w:t>
+      </w:r>
+      <w:proofErr w:type="spellEnd"/>
+      <w:r>
+        <w:rPr>
+          <w:i w:val="0"/>
+          <w:iCs w:val="0"/>
+        </w:rPr>
+        <w:t xml:space="preserve">, lade jag till innehåll i det första tomma elementet och med </w:t>
+      </w:r>
+      <w:proofErr w:type="spellStart"/>
+      <w:r>
+        <w:rPr>
+          <w:i w:val="0"/>
+          <w:iCs w:val="0"/>
+        </w:rPr>
+        <w:t>f</w:t>
+      </w:r>
+      <w:r>
+        <w:rPr>
+          <w:i w:val="0"/>
+          <w:iCs w:val="0"/>
+        </w:rPr>
+        <w:t>lexbox</w:t>
+      </w:r>
+      <w:proofErr w:type="spellEnd"/>
+      <w:r>
+        <w:rPr>
+          <w:i w:val="0"/>
+          <w:iCs w:val="0"/>
+        </w:rPr>
+        <w:t xml:space="preserve"> gjorde detta att jag fick två element bredvid varandra. Sortiment-sektionen till höger och en bild till vänster. Sedan lade jag till en till media </w:t>
+      </w:r>
+      <w:proofErr w:type="spellStart"/>
+      <w:r>
+        <w:rPr>
+          <w:i w:val="0"/>
+          <w:iCs w:val="0"/>
+        </w:rPr>
+        <w:t>query</w:t>
+      </w:r>
+      <w:proofErr w:type="spellEnd"/>
+      <w:r>
+        <w:rPr>
+          <w:i w:val="0"/>
+          <w:iCs w:val="0"/>
+        </w:rPr>
+        <w:t xml:space="preserve"> vid minsta skärmstorlek 1000 </w:t>
+      </w:r>
+      <w:proofErr w:type="spellStart"/>
+      <w:r>
+        <w:rPr>
+          <w:i w:val="0"/>
+          <w:iCs w:val="0"/>
+        </w:rPr>
+        <w:t>px</w:t>
+      </w:r>
+      <w:proofErr w:type="spellEnd"/>
+      <w:r>
+        <w:rPr>
+          <w:i w:val="0"/>
+          <w:iCs w:val="0"/>
+        </w:rPr>
+        <w:t xml:space="preserve"> och där läggs också innehåll i det andra tomma elementet till och resultatet blev tre element bredvid varandra. Sortiment-sektionen i mitten och en bild på varje sida. </w:t>
+      </w:r>
+    </w:p>
+    <w:p>
+      <w:pPr>
+        <w:pStyle w:val="Beskrivning"/>
+        <w:rPr>
+          <w:i w:val="0"/>
+          <w:iCs w:val="0"/>
+        </w:rPr>
+      </w:pPr>
+    </w:p>
+    <w:p>
+      <w:pPr>
+        <w:pStyle w:val="Beskrivning"/>
+        <w:rPr>
+          <w:i w:val="0"/>
+          <w:iCs w:val="0"/>
+        </w:rPr>
+      </w:pPr>
+      <w:r>
+        <w:rPr>
+          <w:i w:val="0"/>
+          <w:iCs w:val="0"/>
+        </w:rPr>
+        <w:t xml:space="preserve">Sidfoten är också den positionerad med </w:t>
+      </w:r>
+      <w:proofErr w:type="spellStart"/>
+      <w:r>
+        <w:rPr>
+          <w:i w:val="0"/>
+          <w:iCs w:val="0"/>
+        </w:rPr>
+        <w:t>flexbox</w:t>
+      </w:r>
+      <w:proofErr w:type="spellEnd"/>
+      <w:r>
+        <w:rPr>
+          <w:i w:val="0"/>
+          <w:iCs w:val="0"/>
+        </w:rPr>
+        <w:t xml:space="preserve"> eftersom jag vill rada upp elementen horisontellt.</w:t>
+      </w:r>
+    </w:p>
+    <w:p>
+      <w:pPr>
+        <w:pStyle w:val="Beskrivning"/>
+        <w:rPr>
+          <w:i w:val="0"/>
+          <w:iCs w:val="0"/>
+        </w:rPr>
+      </w:pPr>
+      <w:r>
+        <w:rPr>
+          <w:noProof/>
+        </w:rPr>
+        <w:lastRenderedPageBreak/>
+        <mc:AlternateContent>
+          <mc:Choice Requires="wps">
+            <w:drawing>
+              <wp:anchor distT="0" distB="0" distL="114300" distR="114300" simplePos="0" relativeHeight="251680768" behindDoc="0" locked="0" layoutInCell="1" allowOverlap="1" wp14:anchorId="75D06CE4" wp14:editId="21839DFD">
+                <wp:simplePos x="0" y="0"/>
+                <wp:positionH relativeFrom="column">
+                  <wp:posOffset>3011170</wp:posOffset>
+                </wp:positionH>
+                <wp:positionV relativeFrom="paragraph">
+                  <wp:posOffset>1785620</wp:posOffset>
+                </wp:positionV>
+                <wp:extent cx="1825625" cy="635"/>
+                <wp:effectExtent l="0" t="0" r="0" b="0"/>
+                <wp:wrapSquare wrapText="bothSides"/>
+                <wp:docPr id="392538705" name="Textruta 1"/>
+                <wp:cNvGraphicFramePr/>
+                <a:graphic xmlns:a="http://schemas.openxmlformats.org/drawingml/2006/main">
+                  <a:graphicData uri="http://schemas.microsoft.com/office/word/2010/wordprocessingShape">
+                    <wps:wsp>
+                      <wps:cNvSpPr txBox="1"/>
+                      <wps:spPr>
+                        <a:xfrm>
+                          <a:off x="0" y="0"/>
+                          <a:ext cx="1825625" cy="635"/>
+                        </a:xfrm>
+                        <a:prstGeom prst="rect">
+                          <a:avLst/>
+                        </a:prstGeom>
+                        <a:solidFill>
+                          <a:prstClr val="white"/>
+                        </a:solidFill>
+                        <a:ln>
+                          <a:noFill/>
+                        </a:ln>
+                      </wps:spPr>
+                      <wps:txbx>
+                        <w:txbxContent>
+                          <w:p>
+                            <w:pPr>
+                              <w:pStyle w:val="Beskrivning"/>
+                            </w:pPr>
+                            <w:r>
+                              <w:t>Figur 11</w:t>
+                            </w:r>
+                          </w:p>
+                        </w:txbxContent>
+                      </wps:txbx>
+                      <wps:bodyPr rot="0" spcFirstLastPara="0" vertOverflow="overflow" horzOverflow="overflow" vert="horz" wrap="square" lIns="0" tIns="0" rIns="0" bIns="0" numCol="1" spcCol="0" rtlCol="0" fromWordArt="0" anchor="t" anchorCtr="0" forceAA="0" compatLnSpc="1">
+                        <a:prstTxWarp prst="textNoShape">
+                          <a:avLst/>
+                        </a:prstTxWarp>
+                        <a:spAutoFit/>
+                      </wps:bodyPr>
+                    </wps:wsp>
+                  </a:graphicData>
+                </a:graphic>
+              </wp:anchor>
+            </w:drawing>
+          </mc:Choice>
+          <mc:Fallback>
+            <w:pict>
+              <v:shape w14:anchorId="75D06CE4" id="_x0000_s1031" type="#_x0000_t202" style="position:absolute;left:0;text-align:left;margin-left:237.1pt;margin-top:140.6pt;width:143.75pt;height:.05pt;z-index:251680768;visibility:visible;mso-wrap-style:square;mso-wrap-distance-left:9pt;mso-wrap-distance-top:0;mso-wrap-distance-right:9pt;mso-wrap-distance-bottom:0;mso-position-horizontal:absolute;mso-position-horizontal-relative:text;mso-position-vertical:absolute;mso-position-vertical-relative:text;v-text-anchor:top" o:gfxdata="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" stroked="f">
+                <v:textbox style="mso-fit-shape-to-text:t" inset="0,0,0,0">
+                  <w:txbxContent>
+                    <w:p>
+                      <w:pPr>
+                        <w:pStyle w:val="Beskrivning"/>
+                      </w:pPr>
+                      <w:r>
+                        <w:t>Figur 11</w:t>
+                      </w:r>
+                    </w:p>
+                  </w:txbxContent>
+                </v:textbox>
+                <w10:wrap type="square"/>
+              </v:shape>
+            </w:pict>
+          </mc:Fallback>
+        </mc:AlternateContent>
+      </w:r>
+      <w:r>
+        <w:rPr>
+          <w:i w:val="0"/>
+          <w:iCs w:val="0"/>
+        </w:rPr>
+        <w:drawing>
+          <wp:anchor distT="0" distB="0" distL="114300" distR="114300" simplePos="0" relativeHeight="251678720" behindDoc="0" locked="0" layoutInCell="1" allowOverlap="1" wp14:anchorId="16C32F47" wp14:editId="05FF9DE3">
+            <wp:simplePos x="0" y="0"/>
+            <wp:positionH relativeFrom="margin">
+              <wp:posOffset>3011391</wp:posOffset>
+            </wp:positionH>
+            <wp:positionV relativeFrom="paragraph">
+              <wp:posOffset>138</wp:posOffset>
+            </wp:positionV>
+            <wp:extent cx="1825625" cy="1728470"/>
+            <wp:effectExtent l="0" t="0" r="3175" b="5080"/>
+            <wp:wrapSquare wrapText="bothSides"/>
+            <wp:docPr id="1786514529" name="Bildobjekt 1"/>
+            <wp:cNvGraphicFramePr>
+              <a:graphicFrameLocks xmlns:a="http://schemas.openxmlformats.org/drawingml/2006/main" noChangeAspect="1"/>
+            </wp:cNvGraphicFramePr>
+            <a:graphic xmlns:a="http://schemas.openxmlformats.org/drawingml/2006/main">
+              <a:graphicData uri="http://schemas.openxmlformats.org/drawingml/2006/picture">
+                <pic:pic xmlns:pic="http://schemas.openxmlformats.org/drawingml/2006/picture">
+                  <pic:nvPicPr>
+                    <pic:cNvPr id="1786514529" name=""/>
+                    <pic:cNvPicPr/>
+                  </pic:nvPicPr>
+                  <pic:blipFill>
+                    <a:blip r:embed="rId24">
+                      <a:extLst>
+                        <a:ext uri="{28A0092B-C50C-407E-A947-70E740481C1C}">
+                          <a14:useLocalDpi xmlns:a14="http://schemas.microsoft.com/office/drawing/2010/main" val="0"/>
+                        </a:ext>
+                      </a:extLst>
+                    </a:blip>
+                    <a:stretch>
+                      <a:fillRect/>
+                    </a:stretch>
+                  </pic:blipFill>
+                  <pic:spPr>
+                    <a:xfrm>
+                      <a:off x="0" y="0"/>
+                      <a:ext cx="1825625" cy="1728470"/>
+                    </a:xfrm>
+                    <a:prstGeom prst="rect">
+                      <a:avLst/>
+                    </a:prstGeom>
+                  </pic:spPr>
+                </pic:pic>
+              </a:graphicData>
+            </a:graphic>
+            <wp14:sizeRelH relativeFrom="page">
+              <wp14:pctWidth>0</wp14:pctWidth>
+            </wp14:sizeRelH>
+            <wp14:sizeRelV relativeFrom="page">
+              <wp14:pctHeight>0</wp14:pctHeight>
+            </wp14:sizeRelV>
+          </wp:anchor>
+        </w:drawing>
+      </w:r>
+      <w:r>
+        <w:rPr>
+          <w:i w:val="0"/>
+          <w:iCs w:val="0"/>
+        </w:rPr>
+        <w:t xml:space="preserve">På sidan ”Om oss” </w:t>
+      </w:r>
+      <w:r>
+        <w:rPr>
+          <w:i w:val="0"/>
+          <w:iCs w:val="0"/>
+        </w:rPr>
+        <w:t>valde jag att använda CSS Grid för att placera text och bild i både rader och kolumner. Först i mobilstorlek ligger elementen i en kolumn</w:t>
+      </w:r>
+      <w:r>
+        <w:rPr>
+          <w:i w:val="0"/>
+          <w:iCs w:val="0"/>
+        </w:rPr>
+        <w:t>:</w:t>
+      </w:r>
+      <w:r>
+        <w:rPr>
+          <w:i w:val="0"/>
+          <w:iCs w:val="0"/>
+        </w:rPr>
+        <w:t xml:space="preserve"> bild 1, text 1, bild 2 och text 2. Sedan använder jag media </w:t>
+      </w:r>
+      <w:proofErr w:type="spellStart"/>
+      <w:r>
+        <w:rPr>
+          <w:i w:val="0"/>
+          <w:iCs w:val="0"/>
+        </w:rPr>
+        <w:t>query</w:t>
+      </w:r>
+      <w:proofErr w:type="spellEnd"/>
+      <w:r>
+        <w:rPr>
+          <w:i w:val="0"/>
+          <w:iCs w:val="0"/>
+        </w:rPr>
+        <w:t xml:space="preserve"> för att ändra till två kolumner vid större skärmbredd. Men jag positionerar också elementen efter </w:t>
+      </w:r>
+      <w:proofErr w:type="spellStart"/>
+      <w:r>
+        <w:rPr>
+          <w:i w:val="0"/>
+          <w:iCs w:val="0"/>
+        </w:rPr>
+        <w:t>grid</w:t>
+      </w:r>
+      <w:proofErr w:type="spellEnd"/>
+      <w:r>
+        <w:rPr>
+          <w:i w:val="0"/>
+          <w:iCs w:val="0"/>
+        </w:rPr>
+        <w:t>-</w:t>
+      </w:r>
+      <w:r>
+        <w:rPr>
+          <w:i w:val="0"/>
+          <w:iCs w:val="0"/>
+        </w:rPr>
+        <w:t>linjer</w:t>
+      </w:r>
+      <w:r>
+        <w:rPr>
+          <w:i w:val="0"/>
+          <w:iCs w:val="0"/>
+        </w:rPr>
+        <w:t>na för att flytta bild två till höger och text två till vänster.</w:t>
+      </w:r>
+    </w:p>
+    <w:p>
+      <w:pPr>
+        <w:pStyle w:val="Beskrivning"/>
+        <w:rPr>
+          <w:i w:val="0"/>
+          <w:iCs w:val="0"/>
+        </w:rPr>
+      </w:pPr>
+    </w:p>
+    <w:p>
+      <w:pPr>
+        <w:pStyle w:val="Beskrivning"/>
+        <w:rPr>
+          <w:i w:val="0"/>
+          <w:iCs w:val="0"/>
+        </w:rPr>
+      </w:pPr>
+      <w:r>
+        <w:rPr>
+          <w:i w:val="0"/>
+          <w:iCs w:val="0"/>
+        </w:rPr>
+        <w:t>https://developer.mozilla.org/en-US/docs/Web/CSS/Guides/Grid_layout/Basic_concepts</w:t>
+      </w:r>
+    </w:p>
+    <w:p>
+      <w:pPr>
+        <w:pStyle w:val="Beskrivning"/>
+        <w:jc w:val="left"/>
+        <w:rPr>
+          <w:i w:val="0"/>
+          <w:iCs w:val="0"/>
+        </w:rPr>
+      </w:pPr>
+    </w:p>
+    <w:p>
+      <w:pPr>
+        <w:pStyle w:val="Beskrivning"/>
+        <w:jc w:val="left"/>
+        <w:rPr>
+          <w:i w:val="0"/>
+          <w:iCs w:val="0"/>
+        </w:rPr>
       </w:pPr>
     </w:p>
     <w:p>
@@ -4045,7 +6118,7 @@
         </w:rPr>
         <w:t xml:space="preserve">, Vancouver Style” </w:t>
       </w:r>
-      <w:hyperlink r:id="rId13" w:history="1">
+      <w:hyperlink r:id="rId25" w:history="1">
         <w:r>
           <w:rPr>
             <w:lang w:val="en-GB"/>
@@ -4374,8 +6447,8 @@
       </w:pPr>
     </w:p>
     <w:sectPr>
-      <w:headerReference w:type="default" r:id="rId14"/>
-      <w:footerReference w:type="default" r:id="rId15"/>
+      <w:headerReference w:type="default" r:id="rId26"/>
+      <w:footerReference w:type="default" r:id="rId27"/>
       <w:pgSz w:w="11906" w:h="16838"/>
       <w:pgMar w:top="1700" w:right="2098" w:bottom="1326" w:left="2098" w:header="1134" w:footer="760" w:gutter="0"/>
       <w:pgNumType w:start="1"/>
@@ -4602,8 +6675,18 @@
       <w:t>-</w:t>
     </w:r>
     <w:r>
-      <w:t>14</w:t>
+      <w:t>28</w:t>
     </w:r>
+  </w:p>
+  <w:p>
+    <w:pPr>
+      <w:pStyle w:val="Sidhuvud"/>
+      <w:tabs>
+        <w:tab w:val="clear" w:pos="4819"/>
+        <w:tab w:val="clear" w:pos="9638"/>
+        <w:tab w:val="right" w:pos="7695"/>
+      </w:tabs>
+    </w:pPr>
   </w:p>
 </w:hdr>
 </file>
@@ -4637,8 +6720,33 @@
     </w:r>
     <w:r>
       <w:tab/>
-      <w:t>2010-07-05</w:t>
+      <w:t>20</w:t>
     </w:r>
+    <w:r>
+      <w:t>26</w:t>
+    </w:r>
+    <w:r>
+      <w:t>-</w:t>
+    </w:r>
+    <w:r>
+      <w:t>10</w:t>
+    </w:r>
+    <w:r>
+      <w:t>-</w:t>
+    </w:r>
+    <w:r>
+      <w:t>28</w:t>
+    </w:r>
+  </w:p>
+  <w:p>
+    <w:pPr>
+      <w:pStyle w:val="Sidhuvud"/>
+      <w:tabs>
+        <w:tab w:val="clear" w:pos="4819"/>
+        <w:tab w:val="clear" w:pos="9638"/>
+        <w:tab w:val="right" w:pos="7725"/>
+      </w:tabs>
+    </w:pPr>
   </w:p>
 </w:hdr>
 </file>
@@ -5772,6 +7880,29 @@
       </w:numPr>
     </w:pPr>
   </w:style>
+  <w:style w:type="character" w:styleId="Hyperlnk">
+    <w:name w:val="Hyperlink"/>
+    <w:basedOn w:val="Standardstycketeckensnitt"/>
+    <w:uiPriority w:val="99"/>
+    <w:unhideWhenUsed/>
+    <w:rsid w:val="007B6800"/>
+    <w:rPr>
+      <w:color w:val="0563C1" w:themeColor="hyperlink"/>
+      <w:u w:val="single"/>
+    </w:rPr>
+  </w:style>
+  <w:style w:type="character" w:styleId="Olstomnmnande">
+    <w:name w:val="Unresolved Mention"/>
+    <w:basedOn w:val="Standardstycketeckensnitt"/>
+    <w:uiPriority w:val="99"/>
+    <w:semiHidden/>
+    <w:unhideWhenUsed/>
+    <w:rsid w:val="007B6800"/>
+    <w:rPr>
+      <w:color w:val="605E5C"/>
+      <w:shd w:val="clear" w:color="auto" w:fill="E1DFDD"/>
+    </w:rPr>
+  </w:style>
 </w:styles>
 </file>
 
@@ -6068,4 +8199,16 @@
     </a:ext>
   </a:extLst>
 </a:theme>
+</file>
+
+<file path=customXml/item1.xml><?xml version="1.0" encoding="utf-8"?>
+<b:Sources xmlns:b="http://schemas.openxmlformats.org/officeDocument/2006/bibliography" xmlns="http://schemas.openxmlformats.org/officeDocument/2006/bibliography" SelectedStyle="\APASixthEditionOfficeOnline.xsl" StyleName="APA" Version="6"/>
+</file>
+
+<file path=customXml/itemProps1.xml><?xml version="1.0" encoding="utf-8"?>
+<ds:datastoreItem xmlns:ds="http://schemas.openxmlformats.org/officeDocument/2006/customXml" ds:itemID="{17BFCDC7-AA49-4FD5-96EF-B3DDACDFA510}">
+  <ds:schemaRefs>
+    <ds:schemaRef ds:uri="http://schemas.openxmlformats.org/officeDocument/2006/bibliography"/>
+  </ds:schemaRefs>
+</ds:datastoreItem>
 </file>
</xml_diff>

<commit_message>
Förenklat sektionen med kategorier på sortiment-sidan och assortment.js, samt tagit bort skickat meddelande på kontakt-sidan
</commit_message>
<xml_diff>
--- a/Rapport.docx
+++ b/Rapport.docx
@@ -678,18 +678,8 @@
           <w:sz w:val="22"/>
           <w:szCs w:val="22"/>
         </w:rPr>
-        <w:t xml:space="preserve"> Webbutveckling, 120 </w:t>
-      </w:r>
-      <w:proofErr w:type="spellStart"/>
-      <w:r>
-        <w:rPr>
-          <w:rFonts w:ascii="FreeSans" w:hAnsi="FreeSans" w:cs="Arial"/>
-          <w:sz w:val="22"/>
-          <w:szCs w:val="22"/>
-        </w:rPr>
-        <w:t>hp</w:t>
-      </w:r>
-      <w:proofErr w:type="spellEnd"/>
+        <w:t xml:space="preserve"> Webbutveckling, 120 hp</w:t>
+      </w:r>
       <w:r>
         <w:rPr>
           <w:rFonts w:ascii="FreeSans" w:hAnsi="FreeSans" w:cs="Arial"/>
@@ -776,23 +766,7 @@
         <w:outlineLvl w:val="0"/>
       </w:pPr>
       <w:r>
-        <w:t>Sammanfattningen fungerar som en beskrivning av rapportens innehåll. Den ska underlätta en snabb genomgång av dokumentet och därför utgöra ett koncentrat av rapporten i sin helhet, det vill säga rymma allt från syfte och metod till resultat och slutsats. Exempel: ”Målet med denna undersökning har varit att besvara frågan</w:t>
-      </w:r>
-      <w:proofErr w:type="gramStart"/>
-      <w:r>
-        <w:t>… .</w:t>
-      </w:r>
-      <w:proofErr w:type="gramEnd"/>
-      <w:r>
-        <w:t xml:space="preserve"> Undersökningen har genomförts med hjälp av…. Undersökningen har visat att…”. Nämn inget stoff som inte behandlas i rapporten. Sammanfattning skrivs i ett stycke. </w:t>
-      </w:r>
-      <w:proofErr w:type="gramStart"/>
-      <w:r>
-        <w:t>200-250</w:t>
-      </w:r>
-      <w:proofErr w:type="gramEnd"/>
-      <w:r>
-        <w:t xml:space="preserve"> ord är en rekommendation. Hänvisningar till rapportens text, källor eller bilagor är inte tillåtet, utan sammanfattningen ska ”stå på egna ben”. Undvik såväl formler och matematiska symboler som kursiv och fet stil. Sammanfattningen kan avslutas med en uppräkning av nyckelord, som kan underlätta sökande efter rapporten i biblioteksdatabaser. Exempel:</w:t>
+        <w:t>Sammanfattningen fungerar som en beskrivning av rapportens innehåll. Den ska underlätta en snabb genomgång av dokumentet och därför utgöra ett koncentrat av rapporten i sin helhet, det vill säga rymma allt från syfte och metod till resultat och slutsats. Exempel: ”Målet med denna undersökning har varit att besvara frågan… . Undersökningen har genomförts med hjälp av…. Undersökningen har visat att…”. Nämn inget stoff som inte behandlas i rapporten. Sammanfattning skrivs i ett stycke. 200-250 ord är en rekommendation. Hänvisningar till rapportens text, källor eller bilagor är inte tillåtet, utan sammanfattningen ska ”stå på egna ben”. Undvik såväl formler och matematiska symboler som kursiv och fet stil. Sammanfattningen kan avslutas med en uppräkning av nyckelord, som kan underlätta sökande efter rapporten i biblioteksdatabaser. Exempel:</w:t>
       </w:r>
     </w:p>
     <w:p>
@@ -808,15 +782,7 @@
         <w:t>Nyckelord:</w:t>
       </w:r>
       <w:r>
-        <w:t xml:space="preserve"> Människa-dator-interaktion, XML, </w:t>
-      </w:r>
-      <w:proofErr w:type="gramStart"/>
-      <w:r>
-        <w:t>Linux ,</w:t>
-      </w:r>
-      <w:proofErr w:type="gramEnd"/>
-      <w:r>
-        <w:t xml:space="preserve"> Java.</w:t>
+        <w:t xml:space="preserve"> Människa-dator-interaktion, XML, Linux , Java.</w:t>
       </w:r>
     </w:p>
     <w:p>
@@ -1446,13 +1412,8 @@
               <w:pStyle w:val="Textbody"/>
               <w:jc w:val="left"/>
             </w:pPr>
-            <w:proofErr w:type="spellStart"/>
             <w:r>
-              <w:t>Acknowledge</w:t>
-            </w:r>
-            <w:proofErr w:type="spellEnd"/>
-            <w:r>
-              <w:t>. Kvittering av korrekt överfört meddelande.</w:t>
+              <w:t>Acknowledge. Kvittering av korrekt överfört meddelande.</w:t>
             </w:r>
           </w:p>
         </w:tc>
@@ -1493,29 +1454,8 @@
               <w:pStyle w:val="TableContents"/>
               <w:jc w:val="left"/>
             </w:pPr>
-            <w:proofErr w:type="spellStart"/>
             <w:r>
-              <w:t>Additive</w:t>
-            </w:r>
-            <w:proofErr w:type="spellEnd"/>
-            <w:r>
-              <w:t xml:space="preserve"> White </w:t>
-            </w:r>
-            <w:proofErr w:type="spellStart"/>
-            <w:r>
-              <w:t>Gaussian</w:t>
-            </w:r>
-            <w:proofErr w:type="spellEnd"/>
-            <w:r>
-              <w:t xml:space="preserve"> </w:t>
-            </w:r>
-            <w:proofErr w:type="spellStart"/>
-            <w:r>
-              <w:t>Noise</w:t>
-            </w:r>
-            <w:proofErr w:type="spellEnd"/>
-            <w:r>
-              <w:t>.</w:t>
+              <w:t>Additive White Gaussian Noise.</w:t>
             </w:r>
           </w:p>
         </w:tc>
@@ -1797,15 +1737,7 @@
         <w:pStyle w:val="Textbody"/>
       </w:pPr>
       <w:r>
-        <w:t>Målgruppen är vuxna personer som bor i området runt ”</w:t>
-      </w:r>
-      <w:proofErr w:type="spellStart"/>
-      <w:r>
-        <w:t>Bakarstaden</w:t>
-      </w:r>
-      <w:proofErr w:type="spellEnd"/>
-      <w:r>
-        <w:t>”.</w:t>
+        <w:t>Målgruppen är vuxna personer som bor i området runt ”Bakarstaden”.</w:t>
       </w:r>
     </w:p>
     <w:p>
@@ -1842,19 +1774,9 @@
         <w:pStyle w:val="Textbody"/>
         <w:jc w:val="left"/>
       </w:pPr>
-      <w:proofErr w:type="spellStart"/>
-      <w:r>
-        <w:t>Wireframe</w:t>
-      </w:r>
-      <w:proofErr w:type="spellEnd"/>
-      <w:r>
-        <w:t>/</w:t>
-      </w:r>
-      <w:proofErr w:type="spellStart"/>
-      <w:r>
-        <w:t>Mockup</w:t>
-      </w:r>
-      <w:proofErr w:type="spellEnd"/>
+      <w:r>
+        <w:t>Wireframe/Mockup</w:t>
+      </w:r>
     </w:p>
     <w:p>
       <w:pPr>
@@ -1904,13 +1826,8 @@
       <w:pPr>
         <w:pStyle w:val="Textbody"/>
       </w:pPr>
-      <w:proofErr w:type="spellStart"/>
-      <w:r>
-        <w:t>Flexbox</w:t>
-      </w:r>
-      <w:proofErr w:type="spellEnd"/>
-      <w:r>
-        <w:t xml:space="preserve"> och CSS Grid,</w:t>
+      <w:r>
+        <w:t>Flexbox och CSS Grid,</w:t>
       </w:r>
     </w:p>
     <w:p>
@@ -1925,29 +1842,16 @@
       <w:pPr>
         <w:pStyle w:val="Textbody"/>
       </w:pPr>
-      <w:proofErr w:type="spellStart"/>
-      <w:r>
-        <w:t>localStorage</w:t>
-      </w:r>
-      <w:proofErr w:type="spellEnd"/>
-      <w:r>
-        <w:t>,</w:t>
-      </w:r>
-    </w:p>
-    <w:p>
-      <w:pPr>
-        <w:pStyle w:val="Textbody"/>
-      </w:pPr>
-      <w:r>
-        <w:t xml:space="preserve">asynkron programmering och </w:t>
-      </w:r>
-      <w:proofErr w:type="spellStart"/>
-      <w:r>
-        <w:t>Fetch</w:t>
-      </w:r>
-      <w:proofErr w:type="spellEnd"/>
-      <w:r>
-        <w:t xml:space="preserve"> API,</w:t>
+      <w:r>
+        <w:t>localStorage,</w:t>
+      </w:r>
+    </w:p>
+    <w:p>
+      <w:pPr>
+        <w:pStyle w:val="Textbody"/>
+      </w:pPr>
+      <w:r>
+        <w:t>asynkron programmering och Fetch API,</w:t>
       </w:r>
     </w:p>
     <w:p>
@@ -1965,15 +1869,7 @@
         <w:jc w:val="left"/>
       </w:pPr>
       <w:r>
-        <w:t xml:space="preserve">Korta citat omges med citationstecken. Att citera </w:t>
-      </w:r>
-      <w:proofErr w:type="gramStart"/>
-      <w:r>
-        <w:t>Strömqvist  kan</w:t>
-      </w:r>
-      <w:proofErr w:type="gramEnd"/>
-      <w:r>
-        <w:t xml:space="preserve"> vara en passande illustration i detta sammanhang: "Det må vara svårt att skriva, men det är roligt också" </w:t>
+        <w:t xml:space="preserve">Korta citat omges med citationstecken. Att citera Strömqvist  kan vara en passande illustration i detta sammanhang: "Det må vara svårt att skriva, men det är roligt också" </w:t>
       </w:r>
       <w:r>
         <w:fldChar w:fldCharType="begin"/>
@@ -2110,15 +2006,7 @@
         <w:fldChar w:fldCharType="end"/>
       </w:r>
       <w:r>
-        <w:t xml:space="preserve">ordnas källförteckningen i den ordning källorna återges i den löpande texten, och källhänvisningen anges i texten med en siffra inom hakparenteser, </w:t>
-      </w:r>
-      <w:proofErr w:type="gramStart"/>
-      <w:r>
-        <w:t>t ex</w:t>
-      </w:r>
-      <w:proofErr w:type="gramEnd"/>
-      <w:r>
-        <w:t xml:space="preserve"> </w:t>
+        <w:t xml:space="preserve">ordnas källförteckningen i den ordning källorna återges i den löpande texten, och källhänvisningen anges i texten med en siffra inom hakparenteser, t ex </w:t>
       </w:r>
       <w:r>
         <w:fldChar w:fldCharType="begin"/>
@@ -2221,21 +2109,7 @@
           <w:lang w:val="en-GB"/>
         </w:rPr>
         <w:tab/>
-        <w:t>M. Eriksson</w:t>
-      </w:r>
-      <w:proofErr w:type="gramStart"/>
-      <w:r>
-        <w:rPr>
-          <w:lang w:val="en-GB"/>
-        </w:rPr>
-        <w:t>, ”Dynamic</w:t>
-      </w:r>
-      <w:proofErr w:type="gramEnd"/>
-      <w:r>
-        <w:rPr>
-          <w:lang w:val="en-GB"/>
-        </w:rPr>
-        <w:t xml:space="preserve"> Single Frequency Networks”, </w:t>
+        <w:t xml:space="preserve">M. Eriksson, ”Dynamic Single Frequency Networks”, </w:t>
       </w:r>
       <w:r>
         <w:rPr>
@@ -2345,20 +2219,7 @@
         <w:jc w:val="left"/>
       </w:pPr>
       <w:r>
-        <w:t xml:space="preserve">Du kan utnyttja ordbehandlingsprogrammet för att automatiskt numrera källförteckningen och källhänvisningarna enligt Vancouver-systemet. </w:t>
-      </w:r>
-      <w:proofErr w:type="gramStart"/>
-      <w:r>
-        <w:t xml:space="preserve">Denna  </w:t>
-      </w:r>
-      <w:proofErr w:type="spellStart"/>
-      <w:r>
-        <w:t>OpenOffice</w:t>
-      </w:r>
-      <w:proofErr w:type="spellEnd"/>
-      <w:proofErr w:type="gramEnd"/>
-      <w:r>
-        <w:t>-mall stödjer ett sätt att göra det på och precis som sägs ovan hittar du exempel på källförteckningar skapad med den metoden i slutet av mallen.</w:t>
+        <w:t>Du kan utnyttja ordbehandlingsprogrammet för att automatiskt numrera källförteckningen och källhänvisningarna enligt Vancouver-systemet. Denna  OpenOffice-mall stödjer ett sätt att göra det på och precis som sägs ovan hittar du exempel på källförteckningar skapad med den metoden i slutet av mallen.</w:t>
       </w:r>
     </w:p>
     <w:p>
@@ -2367,23 +2228,7 @@
         <w:jc w:val="left"/>
       </w:pPr>
       <w:r>
-        <w:t xml:space="preserve">Metoden innebär att du skriver in källans beskrivning i källförteckningen i slutet av dokumentet, i en automatiskt numrerad lista. Därefter markerar du var i den löpande texten källhänvisningen ska placeras, och väljer menyalternativet Infoga -&gt; Korshänvisning, välj </w:t>
-      </w:r>
-      <w:proofErr w:type="gramStart"/>
-      <w:r>
-        <w:t>Numrerade  stycken</w:t>
-      </w:r>
-      <w:proofErr w:type="gramEnd"/>
-      <w:r>
-        <w:t xml:space="preserve"> i </w:t>
-      </w:r>
-      <w:proofErr w:type="spellStart"/>
-      <w:r>
-        <w:t>Fälttyps</w:t>
-      </w:r>
-      <w:proofErr w:type="spellEnd"/>
-      <w:r>
-        <w:t xml:space="preserve">-fönstret, scrolla ner i Urvalsfönstret och markera den referens du vill referera till och välj därefter Nummer i fönstret Infoga referens till. Exempel på en sådan källhänvisning: Se </w:t>
+        <w:t xml:space="preserve">Metoden innebär att du skriver in källans beskrivning i källförteckningen i slutet av dokumentet, i en automatiskt numrerad lista. Därefter markerar du var i den löpande texten källhänvisningen ska placeras, och väljer menyalternativet Infoga -&gt; Korshänvisning, välj Numrerade  stycken i Fälttyps-fönstret, scrolla ner i Urvalsfönstret och markera den referens du vill referera till och välj därefter Nummer i fönstret Infoga referens till. Exempel på en sådan källhänvisning: Se </w:t>
       </w:r>
       <w:r>
         <w:fldChar w:fldCharType="begin"/>
@@ -2459,15 +2304,7 @@
         <w:jc w:val="left"/>
       </w:pPr>
       <w:r>
-        <w:t xml:space="preserve">Samtliga illustrationer ska vara kopplade till rapporten genom hänvisning i den löpande texten. Hänvisningarna skrivs på svenska med begynnande gemen Exempel: ”Systemet illustreras av blockschemat i figur 2”, ”Av tabell 3 framgår …” </w:t>
-      </w:r>
-      <w:proofErr w:type="gramStart"/>
-      <w:r>
-        <w:t>etc.</w:t>
-      </w:r>
-      <w:proofErr w:type="gramEnd"/>
-      <w:r>
-        <w:t xml:space="preserve"> På svenska skrivs figur alltid med litet f då de förekommer i löpande text.</w:t>
+        <w:t>Samtliga illustrationer ska vara kopplade till rapporten genom hänvisning i den löpande texten. Hänvisningarna skrivs på svenska med begynnande gemen Exempel: ”Systemet illustreras av blockschemat i figur 2”, ”Av tabell 3 framgår …” etc. På svenska skrivs figur alltid med litet f då de förekommer i löpande text.</w:t>
       </w:r>
     </w:p>
     <w:p>
@@ -2476,23 +2313,7 @@
         <w:jc w:val="left"/>
       </w:pPr>
       <w:r>
-        <w:t xml:space="preserve">Du kan rita illustrationer i </w:t>
-      </w:r>
-      <w:proofErr w:type="spellStart"/>
-      <w:r>
-        <w:t>OpenOffice</w:t>
-      </w:r>
-      <w:proofErr w:type="spellEnd"/>
-      <w:r>
-        <w:t xml:space="preserve"> Draw och kopiera figuren direkt in i </w:t>
-      </w:r>
-      <w:proofErr w:type="spellStart"/>
-      <w:r>
-        <w:t>OpenOffice</w:t>
-      </w:r>
-      <w:proofErr w:type="spellEnd"/>
-      <w:r>
-        <w:t xml:space="preserve"> Writer. För att få figuren att följa texten högerklicka på den och välj Förankring-&gt;Som tecken.</w:t>
+        <w:t>Du kan rita illustrationer i OpenOffice Draw och kopiera figuren direkt in i OpenOffice Writer. För att få figuren att följa texten högerklicka på den och välj Förankring-&gt;Som tecken.</w:t>
       </w:r>
     </w:p>
     <w:p>
@@ -2501,39 +2322,7 @@
         <w:jc w:val="left"/>
       </w:pPr>
       <w:r>
-        <w:t>Den här mallen har en fördefinierad variabel ”</w:t>
-      </w:r>
-      <w:proofErr w:type="spellStart"/>
-      <w:r>
-        <w:t>Figure</w:t>
-      </w:r>
-      <w:proofErr w:type="spellEnd"/>
-      <w:r>
-        <w:t>” vilken kan användas för att åstadkomma automatisk figurnumrering. Du kan kopiera från exemplet ovan eller använda dig av menyalternativet Infoga -&gt; Fältkommando -&gt; Andra och välja fliken Variabler. Där väljer du ”</w:t>
-      </w:r>
-      <w:proofErr w:type="spellStart"/>
-      <w:r>
-        <w:t>Figure</w:t>
-      </w:r>
-      <w:proofErr w:type="spellEnd"/>
-      <w:r>
-        <w:t>” i Urvalsfönstret och trycker sedan på Infoga. För automatisk hänvisning till en figur, välj Infoga-&gt; Korshänvisning. Välj ”</w:t>
-      </w:r>
-      <w:proofErr w:type="spellStart"/>
-      <w:r>
-        <w:t>Figure</w:t>
-      </w:r>
-      <w:proofErr w:type="spellEnd"/>
-      <w:r>
-        <w:t xml:space="preserve">” i Fälttypsrutan och välj vilken figur du vill referera till i Urval. Kom ihåg att välja Nummer i Infoga referens till-rutan </w:t>
-      </w:r>
-      <w:proofErr w:type="gramStart"/>
-      <w:r>
-        <w:t>och  avsluta</w:t>
-      </w:r>
-      <w:proofErr w:type="gramEnd"/>
-      <w:r>
-        <w:t xml:space="preserve"> med Infoga. Hänvisningar till figuren, figur 1, ovan är skapade med hjälp av dessa funktioner.</w:t>
+        <w:t>Den här mallen har en fördefinierad variabel ”Figure” vilken kan användas för att åstadkomma automatisk figurnumrering. Du kan kopiera från exemplet ovan eller använda dig av menyalternativet Infoga -&gt; Fältkommando -&gt; Andra och välja fliken Variabler. Där väljer du ”Figure” i Urvalsfönstret och trycker sedan på Infoga. För automatisk hänvisning till en figur, välj Infoga-&gt; Korshänvisning. Välj ”Figure” i Fälttypsrutan och välj vilken figur du vill referera till i Urval. Kom ihåg att välja Nummer i Infoga referens till-rutan och  avsluta med Infoga. Hänvisningar till figuren, figur 1, ovan är skapade med hjälp av dessa funktioner.</w:t>
       </w:r>
     </w:p>
     <w:p>
@@ -2552,15 +2341,7 @@
       </w:pPr>
       <w:r>
         <w:lastRenderedPageBreak/>
-        <w:t xml:space="preserve">Tabell 1 visar en exempeltabell. Automatisk numrering fungerar på samma sätt som för figurer men du använder dig av variabeln ”Tabell” </w:t>
-      </w:r>
-      <w:proofErr w:type="gramStart"/>
-      <w:r>
-        <w:t>istället</w:t>
-      </w:r>
-      <w:proofErr w:type="gramEnd"/>
-      <w:r>
-        <w:t>. Att Referera till tabeller i texten följer samma regler som för figurer och utförs på liknande sätt.</w:t>
+        <w:t>Tabell 1 visar en exempeltabell. Automatisk numrering fungerar på samma sätt som för figurer men du använder dig av variabeln ”Tabell” istället. Att Referera till tabeller i texten följer samma regler som för figurer och utförs på liknande sätt.</w:t>
       </w:r>
     </w:p>
     <w:p>
@@ -2728,13 +2509,8 @@
               <w:pStyle w:val="TableContents"/>
             </w:pPr>
             <w:r>
-              <w:t xml:space="preserve">10 </w:t>
+              <w:t>10 ms</w:t>
             </w:r>
-            <w:proofErr w:type="spellStart"/>
-            <w:r>
-              <w:t>ms</w:t>
-            </w:r>
-            <w:proofErr w:type="spellEnd"/>
           </w:p>
         </w:tc>
         <w:tc>
@@ -2756,13 +2532,8 @@
               <w:pStyle w:val="TableContents"/>
             </w:pPr>
             <w:r>
-              <w:t xml:space="preserve">30 </w:t>
+              <w:t>30 ms</w:t>
             </w:r>
-            <w:proofErr w:type="spellStart"/>
-            <w:r>
-              <w:t>ms</w:t>
-            </w:r>
-            <w:proofErr w:type="spellEnd"/>
           </w:p>
         </w:tc>
         <w:tc>
@@ -2785,13 +2556,8 @@
               <w:pStyle w:val="TableContents"/>
             </w:pPr>
             <w:r>
-              <w:t xml:space="preserve">20 </w:t>
+              <w:t>20 ms</w:t>
             </w:r>
-            <w:proofErr w:type="spellStart"/>
-            <w:r>
-              <w:t>ms</w:t>
-            </w:r>
-            <w:proofErr w:type="spellEnd"/>
           </w:p>
         </w:tc>
       </w:tr>
@@ -2840,13 +2606,8 @@
               <w:pStyle w:val="TableContents"/>
             </w:pPr>
             <w:r>
-              <w:t xml:space="preserve">20 </w:t>
+              <w:t>20 ms</w:t>
             </w:r>
-            <w:proofErr w:type="spellStart"/>
-            <w:r>
-              <w:t>ms</w:t>
-            </w:r>
-            <w:proofErr w:type="spellEnd"/>
           </w:p>
         </w:tc>
         <w:tc>
@@ -2868,13 +2629,8 @@
               <w:pStyle w:val="TableContents"/>
             </w:pPr>
             <w:r>
-              <w:t xml:space="preserve">40 </w:t>
+              <w:t>40 ms</w:t>
             </w:r>
-            <w:proofErr w:type="spellStart"/>
-            <w:r>
-              <w:t>ms</w:t>
-            </w:r>
-            <w:proofErr w:type="spellEnd"/>
           </w:p>
         </w:tc>
         <w:tc>
@@ -2897,13 +2653,8 @@
               <w:pStyle w:val="TableContents"/>
             </w:pPr>
             <w:r>
-              <w:t xml:space="preserve">35 </w:t>
+              <w:t>35 ms</w:t>
             </w:r>
-            <w:proofErr w:type="spellStart"/>
-            <w:r>
-              <w:t>ms</w:t>
-            </w:r>
-            <w:proofErr w:type="spellEnd"/>
           </w:p>
         </w:tc>
       </w:tr>
@@ -3246,68 +2997,15 @@
         <w:pStyle w:val="Textbody"/>
       </w:pPr>
       <w:r>
-        <w:t xml:space="preserve">Du kan enkelt lägga till och editera </w:t>
-      </w:r>
-      <w:proofErr w:type="gramStart"/>
-      <w:r>
-        <w:t>matematisk formler</w:t>
-      </w:r>
-      <w:proofErr w:type="gramEnd"/>
-      <w:r>
-        <w:t xml:space="preserve"> med </w:t>
-      </w:r>
-      <w:proofErr w:type="gramStart"/>
-      <w:r>
-        <w:t>ekvationseditorn  som</w:t>
-      </w:r>
-      <w:proofErr w:type="gramEnd"/>
-      <w:r>
-        <w:t xml:space="preserve"> du finner under </w:t>
-      </w:r>
-      <w:proofErr w:type="spellStart"/>
-      <w:r>
-        <w:t>under</w:t>
-      </w:r>
-      <w:proofErr w:type="spellEnd"/>
-      <w:r>
-        <w:t xml:space="preserve"> Infoga -&gt; Objekt -&gt; Formel...”.</w:t>
-      </w:r>
-    </w:p>
-    <w:p>
-      <w:pPr>
-        <w:pStyle w:val="Textbody"/>
-      </w:pPr>
-      <w:r>
-        <w:t xml:space="preserve">Exempel på referens till en ekvation: Utifrån </w:t>
-      </w:r>
-      <w:proofErr w:type="spellStart"/>
-      <w:proofErr w:type="gramStart"/>
-      <w:r>
-        <w:t>ekv</w:t>
-      </w:r>
-      <w:proofErr w:type="spellEnd"/>
-      <w:r>
-        <w:t>(</w:t>
-      </w:r>
-      <w:proofErr w:type="gramEnd"/>
-      <w:r>
-        <w:t xml:space="preserve">1) inses att den mottagna effekten är proportionerlig mot sändareffekten. I </w:t>
-      </w:r>
-      <w:proofErr w:type="spellStart"/>
-      <w:r>
-        <w:t>OpenOffice</w:t>
-      </w:r>
-      <w:proofErr w:type="spellEnd"/>
-      <w:r>
-        <w:t xml:space="preserve"> refererar och numrerar du ekvationer på samma sätt som figurer och tabeller, använd bara ”Formula” som </w:t>
-      </w:r>
-      <w:proofErr w:type="spellStart"/>
-      <w:r>
-        <w:t>Fälttyp</w:t>
-      </w:r>
-      <w:proofErr w:type="spellEnd"/>
-      <w:r>
-        <w:t>.</w:t>
+        <w:t>Du kan enkelt lägga till och editera matematisk formler med ekvationseditorn  som du finner under under Infoga -&gt; Objekt -&gt; Formel...”.</w:t>
+      </w:r>
+    </w:p>
+    <w:p>
+      <w:pPr>
+        <w:pStyle w:val="Textbody"/>
+      </w:pPr>
+      <w:r>
+        <w:t>Exempel på referens till en ekvation: Utifrån ekv(1) inses att den mottagna effekten är proportionerlig mot sändareffekten. I OpenOffice refererar och numrerar du ekvationer på samma sätt som figurer och tabeller, använd bara ”Formula” som Fälttyp.</w:t>
       </w:r>
     </w:p>
     <w:p>
@@ -3342,29 +3040,8 @@
       <w:r>
         <w:t xml:space="preserve">webbplatsens struktur, innehåll och navigering planeras genom att skapa </w:t>
       </w:r>
-      <w:proofErr w:type="spellStart"/>
-      <w:r>
-        <w:t>wireframes</w:t>
-      </w:r>
-      <w:proofErr w:type="spellEnd"/>
-      <w:r>
-        <w:t xml:space="preserve"> i designverktyget </w:t>
-      </w:r>
-      <w:proofErr w:type="spellStart"/>
-      <w:r>
-        <w:t>Figma</w:t>
-      </w:r>
-      <w:proofErr w:type="spellEnd"/>
-      <w:r>
-        <w:t xml:space="preserve">. Det kommer att vara minst en </w:t>
-      </w:r>
-      <w:proofErr w:type="spellStart"/>
-      <w:r>
-        <w:t>wireframe</w:t>
-      </w:r>
-      <w:proofErr w:type="spellEnd"/>
-      <w:r>
-        <w:t xml:space="preserve"> för mobil och en för stor skärm.</w:t>
+      <w:r>
+        <w:t>wireframes i designverktyget Figma. Det kommer att vara minst en wireframe för mobil och en för stor skärm.</w:t>
       </w:r>
     </w:p>
     <w:p>
@@ -3373,31 +3050,7 @@
         <w:jc w:val="left"/>
       </w:pPr>
       <w:r>
-        <w:t xml:space="preserve">När arbetet med </w:t>
-      </w:r>
-      <w:proofErr w:type="spellStart"/>
-      <w:r>
-        <w:t>wireframes</w:t>
-      </w:r>
-      <w:proofErr w:type="spellEnd"/>
-      <w:r>
-        <w:t xml:space="preserve"> är klart kommer jag gå vidare med att planera webbplatsens utseende i en eller flera </w:t>
-      </w:r>
-      <w:proofErr w:type="spellStart"/>
-      <w:r>
-        <w:t>mockups</w:t>
-      </w:r>
-      <w:proofErr w:type="spellEnd"/>
-      <w:r>
-        <w:t xml:space="preserve">. Även detta kommer att göras i </w:t>
-      </w:r>
-      <w:proofErr w:type="spellStart"/>
-      <w:r>
-        <w:t>Figma</w:t>
-      </w:r>
-      <w:proofErr w:type="spellEnd"/>
-      <w:r>
-        <w:t>. Här kommer det framgå vilka färger, typsnitt och bilder som jag planerar att använda.</w:t>
+        <w:t>När arbetet med wireframes är klart kommer jag gå vidare med att planera webbplatsens utseende i en eller flera mockups. Även detta kommer att göras i Figma. Här kommer det framgå vilka färger, typsnitt och bilder som jag planerar att använda.</w:t>
       </w:r>
     </w:p>
     <w:p>
@@ -3412,21 +3065,8 @@
         <w:t xml:space="preserve"> och det blir då lättare att få en bra överblick</w:t>
       </w:r>
       <w:r>
-        <w:t xml:space="preserve">. Projektet kommer att skapas i Visual Studio Code och </w:t>
-      </w:r>
-      <w:proofErr w:type="spellStart"/>
-      <w:r>
-        <w:t>versionshanteras</w:t>
-      </w:r>
-      <w:proofErr w:type="spellEnd"/>
-      <w:r>
-        <w:t xml:space="preserve"> genom </w:t>
-      </w:r>
-      <w:proofErr w:type="spellStart"/>
-      <w:r>
-        <w:t>Github</w:t>
-      </w:r>
-      <w:proofErr w:type="spellEnd"/>
+        <w:t>. Projektet kommer att skapas i Visual Studio Code och versionshanteras genom Github</w:t>
+      </w:r>
       <w:r>
         <w:t xml:space="preserve"> dels </w:t>
       </w:r>
@@ -3434,18 +3074,10 @@
         <w:t xml:space="preserve">för att spara säkra kopior </w:t>
       </w:r>
       <w:r>
-        <w:t xml:space="preserve">av </w:t>
-      </w:r>
-      <w:proofErr w:type="gramStart"/>
-      <w:r>
-        <w:t>arbetet</w:t>
-      </w:r>
-      <w:r>
-        <w:t xml:space="preserve"> och även</w:t>
-      </w:r>
-      <w:proofErr w:type="gramEnd"/>
-      <w:r>
-        <w:t xml:space="preserve"> för att kunna följa arbetets utveckling</w:t>
+        <w:t>av arbetet</w:t>
+      </w:r>
+      <w:r>
+        <w:t xml:space="preserve"> och även för att kunna följa arbetets utveckling</w:t>
       </w:r>
       <w:r>
         <w:t>.</w:t>
@@ -3457,22 +3089,10 @@
         <w:jc w:val="left"/>
       </w:pPr>
       <w:r>
-        <w:t>Versionshanteringen kommer att börja i en huvudgren (</w:t>
-      </w:r>
-      <w:proofErr w:type="spellStart"/>
-      <w:r>
-        <w:t>main</w:t>
-      </w:r>
-      <w:proofErr w:type="spellEnd"/>
-      <w:r>
-        <w:t xml:space="preserve">) i </w:t>
-      </w:r>
-      <w:r>
-        <w:t xml:space="preserve">projektets </w:t>
-      </w:r>
-      <w:proofErr w:type="spellStart"/>
-      <w:r>
-        <w:t>G</w:t>
+        <w:t xml:space="preserve">Versionshanteringen kommer att börja i en huvudgren (main) i </w:t>
+      </w:r>
+      <w:r>
+        <w:t>projektets G</w:t>
       </w:r>
       <w:r>
         <w:t>it</w:t>
@@ -3481,27 +3101,7 @@
         <w:t>hub</w:t>
       </w:r>
       <w:r>
-        <w:t>-repository</w:t>
-      </w:r>
-      <w:proofErr w:type="spellEnd"/>
-      <w:r>
-        <w:t xml:space="preserve"> och när grunden för webbplatsen är klar kommer utvecklingsarbetet att flyttas till en </w:t>
-      </w:r>
-      <w:proofErr w:type="spellStart"/>
-      <w:r>
-        <w:t>utvecklingsgren</w:t>
-      </w:r>
-      <w:proofErr w:type="spellEnd"/>
-      <w:r>
-        <w:t xml:space="preserve"> (</w:t>
-      </w:r>
-      <w:proofErr w:type="spellStart"/>
-      <w:r>
-        <w:t>dev</w:t>
-      </w:r>
-      <w:proofErr w:type="spellEnd"/>
-      <w:r>
-        <w:t>). Eftersom när delar av utvecklingen blir klar kommer det färdiga arbetet att sparas in på huvudgrenen.</w:t>
+        <w:t>-repository och när grunden för webbplatsen är klar kommer utvecklingsarbetet att flyttas till en utvecklingsgren (dev). Eftersom när delar av utvecklingen blir klar kommer det färdiga arbetet att sparas in på huvudgrenen.</w:t>
       </w:r>
       <w:r>
         <w:t xml:space="preserve"> Detta är ett bra arbetssätt inför framtiden ifall man har e</w:t>
@@ -3558,13 +3158,8 @@
         <w:t>L</w:t>
       </w:r>
       <w:r>
-        <w:t xml:space="preserve">ayouten kommer att styras med CSS </w:t>
-      </w:r>
-      <w:proofErr w:type="spellStart"/>
-      <w:r>
-        <w:t>Flexbox</w:t>
-      </w:r>
-      <w:proofErr w:type="spellEnd"/>
+        <w:t>ayouten kommer att styras med CSS Flexbox</w:t>
+      </w:r>
       <w:r>
         <w:t xml:space="preserve"> där element behöver positioneras antingen vågrätt eller lodrätt </w:t>
       </w:r>
@@ -3590,15 +3185,7 @@
         <w:jc w:val="left"/>
       </w:pPr>
       <w:r>
-        <w:t xml:space="preserve">Webbplatsen kommer att utvecklas enligt strategin ”mobile </w:t>
-      </w:r>
-      <w:proofErr w:type="spellStart"/>
-      <w:r>
-        <w:t>first</w:t>
-      </w:r>
-      <w:proofErr w:type="spellEnd"/>
-      <w:r>
-        <w:t>”, vilket innebär att jag börjar att utveckla för en liten skärm och sedan anpassar designen efter större skärmstorlekar</w:t>
+        <w:t>Webbplatsen kommer att utvecklas enligt strategin ”mobile first”, vilket innebär att jag börjar att utveckla för en liten skärm och sedan anpassar designen efter större skärmstorlekar</w:t>
       </w:r>
       <w:r>
         <w:t xml:space="preserve"> </w:t>
@@ -3607,13 +3194,8 @@
         <w:t>med hjälp av</w:t>
       </w:r>
       <w:r>
-        <w:t xml:space="preserve"> media </w:t>
-      </w:r>
-      <w:proofErr w:type="spellStart"/>
-      <w:r>
-        <w:t>querys</w:t>
-      </w:r>
-      <w:proofErr w:type="spellEnd"/>
+        <w:t xml:space="preserve"> media querys</w:t>
+      </w:r>
       <w:r>
         <w:t>.</w:t>
       </w:r>
@@ -3700,23 +3282,7 @@
         <w:jc w:val="left"/>
       </w:pPr>
       <w:r>
-        <w:t xml:space="preserve">Slutligen kommer webbplatsen att publiceras via </w:t>
-      </w:r>
-      <w:proofErr w:type="spellStart"/>
-      <w:r>
-        <w:t>Github</w:t>
-      </w:r>
-      <w:proofErr w:type="spellEnd"/>
-      <w:r>
-        <w:t xml:space="preserve"> på </w:t>
-      </w:r>
-      <w:proofErr w:type="spellStart"/>
-      <w:r>
-        <w:t>Netlify</w:t>
-      </w:r>
-      <w:proofErr w:type="spellEnd"/>
-      <w:r>
-        <w:t>.</w:t>
+        <w:t>Slutligen kommer webbplatsen att publiceras via Github på Netlify.</w:t>
       </w:r>
     </w:p>
     <w:p>
@@ -3745,31 +3311,7 @@
         <w:jc w:val="left"/>
       </w:pPr>
       <w:r>
-        <w:t xml:space="preserve">Enligt min plan började jag arbetet i designverktyget </w:t>
-      </w:r>
-      <w:proofErr w:type="spellStart"/>
-      <w:r>
-        <w:t>Figma</w:t>
-      </w:r>
-      <w:proofErr w:type="spellEnd"/>
-      <w:r>
-        <w:t xml:space="preserve">. Först skapade jag en </w:t>
-      </w:r>
-      <w:proofErr w:type="spellStart"/>
-      <w:r>
-        <w:t>wireframe</w:t>
-      </w:r>
-      <w:proofErr w:type="spellEnd"/>
-      <w:r>
-        <w:t xml:space="preserve"> för startsidan i mobilstorlek. Jag valde också att göra en </w:t>
-      </w:r>
-      <w:proofErr w:type="spellStart"/>
-      <w:r>
-        <w:t>wireframe</w:t>
-      </w:r>
-      <w:proofErr w:type="spellEnd"/>
-      <w:r>
-        <w:t xml:space="preserve"> för sortiment-sidan då jag hade lite olika funderingar kring hur de olika artiklarna skulle kunna presenteras på sidan.</w:t>
+        <w:t>Enligt min plan började jag arbetet i designverktyget Figma. Först skapade jag en wireframe för startsidan i mobilstorlek. Jag valde också att göra en wireframe för sortiment-sidan då jag hade lite olika funderingar kring hur de olika artiklarna skulle kunna presenteras på sidan.</w:t>
       </w:r>
     </w:p>
     <w:p>
@@ -3839,15 +3381,7 @@
                               </w:rPr>
                             </w:pPr>
                             <w:r>
-                              <w:t xml:space="preserve">Figur 2 – </w:t>
-                            </w:r>
-                            <w:proofErr w:type="spellStart"/>
-                            <w:r>
-                              <w:t>Wireframe</w:t>
-                            </w:r>
-                            <w:proofErr w:type="spellEnd"/>
-                            <w:r>
-                              <w:t xml:space="preserve"> desktop</w:t>
+                              <w:t>Figur 2 – Wireframe desktop</w:t>
                             </w:r>
                           </w:p>
                         </w:txbxContent>
@@ -3881,15 +3415,7 @@
                         </w:rPr>
                       </w:pPr>
                       <w:r>
-                        <w:t xml:space="preserve">Figur 2 – </w:t>
-                      </w:r>
-                      <w:proofErr w:type="spellStart"/>
-                      <w:r>
-                        <w:t>Wireframe</w:t>
-                      </w:r>
-                      <w:proofErr w:type="spellEnd"/>
-                      <w:r>
-                        <w:t xml:space="preserve"> desktop</w:t>
+                        <w:t>Figur 2 – Wireframe desktop</w:t>
                       </w:r>
                     </w:p>
                   </w:txbxContent>
@@ -4021,15 +3547,7 @@
         <w:fldChar w:fldCharType="end"/>
       </w:r>
       <w:r>
-        <w:t xml:space="preserve"> – </w:t>
-      </w:r>
-      <w:proofErr w:type="spellStart"/>
-      <w:r>
-        <w:t>Wireframes</w:t>
-      </w:r>
-      <w:proofErr w:type="spellEnd"/>
-      <w:r>
-        <w:t xml:space="preserve"> mobil</w:t>
+        <w:t xml:space="preserve"> – Wireframes mobil</w:t>
       </w:r>
     </w:p>
     <w:p>
@@ -4044,15 +3562,7 @@
         <w:jc w:val="left"/>
       </w:pPr>
       <w:r>
-        <w:t xml:space="preserve">Sedan gick jag vidare och gjorde en </w:t>
-      </w:r>
-      <w:proofErr w:type="spellStart"/>
-      <w:r>
-        <w:t>wireframe</w:t>
-      </w:r>
-      <w:proofErr w:type="spellEnd"/>
-      <w:r>
-        <w:t xml:space="preserve"> för desktop. Här valde jag att fokusera på sortiment-sidan som jag tyckte var svårast att få till.</w:t>
+        <w:t>Sedan gick jag vidare och gjorde en wireframe för desktop. Här valde jag att fokusera på sortiment-sidan som jag tyckte var svårast att få till.</w:t>
       </w:r>
     </w:p>
     <w:p>
@@ -4061,31 +3571,7 @@
         <w:jc w:val="left"/>
       </w:pPr>
       <w:r>
-        <w:t xml:space="preserve">När strukturen var planerad i mina </w:t>
-      </w:r>
-      <w:proofErr w:type="spellStart"/>
-      <w:r>
-        <w:t>wireframes</w:t>
-      </w:r>
-      <w:proofErr w:type="spellEnd"/>
-      <w:r>
-        <w:t xml:space="preserve"> skulle jag planera utseendet genom att göra </w:t>
-      </w:r>
-      <w:proofErr w:type="spellStart"/>
-      <w:r>
-        <w:t>mockups</w:t>
-      </w:r>
-      <w:proofErr w:type="spellEnd"/>
-      <w:r>
-        <w:t xml:space="preserve"> i </w:t>
-      </w:r>
-      <w:proofErr w:type="spellStart"/>
-      <w:r>
-        <w:t>Figma</w:t>
-      </w:r>
-      <w:proofErr w:type="spellEnd"/>
-      <w:r>
-        <w:t xml:space="preserve">. Men innan jag kunde börja med det behövde jag en logotyp för mitt fiktiva företag. </w:t>
+        <w:t xml:space="preserve">När strukturen var planerad i mina wireframes skulle jag planera utseendet genom att göra mockups i Figma. Men innan jag kunde börja med det behövde jag en logotyp för mitt fiktiva företag. </w:t>
       </w:r>
     </w:p>
     <w:p>
@@ -4169,13 +3655,8 @@
       <w:r>
         <w:t xml:space="preserve"> designade jag i </w:t>
       </w:r>
-      <w:proofErr w:type="spellStart"/>
-      <w:r>
-        <w:t>Photopea</w:t>
-      </w:r>
-      <w:proofErr w:type="spellEnd"/>
-      <w:r>
-        <w:t xml:space="preserve">. </w:t>
+      <w:r>
+        <w:t xml:space="preserve">Photopea. </w:t>
       </w:r>
       <w:r>
         <w:t>Under arbetet med logotypen hittade jag också en grundfärg som jag ville använda i den grafiska profilen.</w:t>
@@ -4288,23 +3769,7 @@
         </mc:AlternateContent>
       </w:r>
       <w:r>
-        <w:t xml:space="preserve">När logotyp och grundfärg var klart satte jag i gång med att utveckla den grafiska profilen i </w:t>
-      </w:r>
-      <w:proofErr w:type="spellStart"/>
-      <w:r>
-        <w:t>Figma</w:t>
-      </w:r>
-      <w:proofErr w:type="spellEnd"/>
-      <w:r>
-        <w:t xml:space="preserve">. Vilket resulterade i följande </w:t>
-      </w:r>
-      <w:proofErr w:type="spellStart"/>
-      <w:r>
-        <w:t>mockups</w:t>
-      </w:r>
-      <w:proofErr w:type="spellEnd"/>
-      <w:r>
-        <w:t>.</w:t>
+        <w:t>När logotyp och grundfärg var klart satte jag i gång med att utveckla den grafiska profilen i Figma. Vilket resulterade i följande mockups.</w:t>
       </w:r>
     </w:p>
     <w:p>
@@ -4363,15 +3828,7 @@
                               </w:rPr>
                             </w:pPr>
                             <w:r>
-                              <w:t xml:space="preserve">Figur 5 – </w:t>
-                            </w:r>
-                            <w:proofErr w:type="spellStart"/>
-                            <w:r>
-                              <w:t>Mockup</w:t>
-                            </w:r>
-                            <w:proofErr w:type="spellEnd"/>
-                            <w:r>
-                              <w:t xml:space="preserve"> desktop</w:t>
+                              <w:t>Figur 5 – Mockup desktop</w:t>
                             </w:r>
                           </w:p>
                         </w:txbxContent>
@@ -4401,15 +3858,7 @@
                         </w:rPr>
                       </w:pPr>
                       <w:r>
-                        <w:t xml:space="preserve">Figur 5 – </w:t>
-                      </w:r>
-                      <w:proofErr w:type="spellStart"/>
-                      <w:r>
-                        <w:t>Mockup</w:t>
-                      </w:r>
-                      <w:proofErr w:type="spellEnd"/>
-                      <w:r>
-                        <w:t xml:space="preserve"> desktop</w:t>
+                        <w:t>Figur 5 – Mockup desktop</w:t>
                       </w:r>
                     </w:p>
                   </w:txbxContent>
@@ -4520,15 +3969,7 @@
         <w:jc w:val="left"/>
       </w:pPr>
       <w:r>
-        <w:t xml:space="preserve">Figur 4 – </w:t>
-      </w:r>
-      <w:proofErr w:type="spellStart"/>
-      <w:r>
-        <w:t>Mockups</w:t>
-      </w:r>
-      <w:proofErr w:type="spellEnd"/>
-      <w:r>
-        <w:t xml:space="preserve"> mobil</w:t>
+        <w:t>Figur 4 – Mockups mobil</w:t>
       </w:r>
     </w:p>
     <w:p>
@@ -4583,39 +4024,7 @@
           <w:i w:val="0"/>
           <w:iCs w:val="0"/>
         </w:rPr>
-        <w:t xml:space="preserve">gång ett nytt </w:t>
-      </w:r>
-      <w:proofErr w:type="spellStart"/>
-      <w:r>
-        <w:rPr>
-          <w:i w:val="0"/>
-          <w:iCs w:val="0"/>
-        </w:rPr>
-        <w:t>repository</w:t>
-      </w:r>
-      <w:proofErr w:type="spellEnd"/>
-      <w:r>
-        <w:rPr>
-          <w:i w:val="0"/>
-          <w:iCs w:val="0"/>
-        </w:rPr>
-        <w:t xml:space="preserve"> i </w:t>
-      </w:r>
-      <w:proofErr w:type="spellStart"/>
-      <w:r>
-        <w:rPr>
-          <w:i w:val="0"/>
-          <w:iCs w:val="0"/>
-        </w:rPr>
-        <w:t>Github</w:t>
-      </w:r>
-      <w:proofErr w:type="spellEnd"/>
-      <w:r>
-        <w:rPr>
-          <w:i w:val="0"/>
-          <w:iCs w:val="0"/>
-        </w:rPr>
-        <w:t xml:space="preserve"> för att komma i gång med versionshanteringen.</w:t>
+        <w:t>gång ett nytt repository i Github för att komma i gång med versionshanteringen.</w:t>
       </w:r>
     </w:p>
     <w:p>
@@ -4631,80 +4040,15 @@
           <w:i w:val="0"/>
           <w:iCs w:val="0"/>
         </w:rPr>
-        <w:t xml:space="preserve">Jag började arbeta med startsidans element och sedan lade jag till </w:t>
-      </w:r>
-      <w:proofErr w:type="spellStart"/>
-      <w:r>
-        <w:rPr>
-          <w:i w:val="0"/>
-          <w:iCs w:val="0"/>
-        </w:rPr>
-        <w:t>css</w:t>
-      </w:r>
-      <w:proofErr w:type="spellEnd"/>
-      <w:r>
-        <w:rPr>
-          <w:i w:val="0"/>
-          <w:iCs w:val="0"/>
-        </w:rPr>
-        <w:t>.</w:t>
-      </w:r>
-      <w:r>
-        <w:rPr>
-          <w:i w:val="0"/>
-          <w:iCs w:val="0"/>
-        </w:rPr>
-        <w:t xml:space="preserve"> Jag valde att positionera menyn med CSS </w:t>
-      </w:r>
-      <w:proofErr w:type="spellStart"/>
-      <w:r>
-        <w:rPr>
-          <w:i w:val="0"/>
-          <w:iCs w:val="0"/>
-        </w:rPr>
-        <w:t>Flexbox</w:t>
-      </w:r>
-      <w:proofErr w:type="spellEnd"/>
-      <w:r>
-        <w:rPr>
-          <w:i w:val="0"/>
-          <w:iCs w:val="0"/>
-        </w:rPr>
-        <w:t xml:space="preserve"> för att få länkarna i menyn att flöda horisontellt på större skärm. För att få till denna </w:t>
-      </w:r>
-      <w:proofErr w:type="spellStart"/>
-      <w:r>
-        <w:rPr>
-          <w:i w:val="0"/>
-          <w:iCs w:val="0"/>
-        </w:rPr>
-        <w:t>responsivitet</w:t>
-      </w:r>
-      <w:proofErr w:type="spellEnd"/>
-      <w:r>
-        <w:rPr>
-          <w:i w:val="0"/>
-          <w:iCs w:val="0"/>
-        </w:rPr>
-        <w:t xml:space="preserve"> använde jag media </w:t>
-      </w:r>
-      <w:proofErr w:type="spellStart"/>
-      <w:r>
-        <w:rPr>
-          <w:i w:val="0"/>
-          <w:iCs w:val="0"/>
-        </w:rPr>
-        <w:t>querys</w:t>
-      </w:r>
-      <w:proofErr w:type="spellEnd"/>
-      <w:r>
-        <w:rPr>
-          <w:i w:val="0"/>
-          <w:iCs w:val="0"/>
-        </w:rPr>
-        <w:t xml:space="preserve"> som lägger till </w:t>
-      </w:r>
-      <w:proofErr w:type="spellStart"/>
+        <w:t>Jag började arbeta med startsidans element och sedan lade jag till css.</w:t>
+      </w:r>
+      <w:r>
+        <w:rPr>
+          <w:i w:val="0"/>
+          <w:iCs w:val="0"/>
+        </w:rPr>
+        <w:t xml:space="preserve"> Jag valde att positionera menyn med CSS Flexbox för att få länkarna i menyn att flöda horisontellt på större skärm. För att få till denna responsivitet använde jag media querys som lägger till </w:t>
+      </w:r>
       <w:r>
         <w:rPr>
           <w:i w:val="0"/>
@@ -4717,38 +4061,14 @@
           <w:i w:val="0"/>
           <w:iCs w:val="0"/>
         </w:rPr>
-        <w:t>lexbox</w:t>
-      </w:r>
-      <w:proofErr w:type="spellEnd"/>
-      <w:r>
-        <w:rPr>
-          <w:i w:val="0"/>
-          <w:iCs w:val="0"/>
-        </w:rPr>
-        <w:t xml:space="preserve"> vid skärmstorlek större än </w:t>
-      </w:r>
-      <w:r>
-        <w:rPr>
-          <w:i w:val="0"/>
-          <w:iCs w:val="0"/>
-        </w:rPr>
-        <w:t xml:space="preserve">750 </w:t>
-      </w:r>
-      <w:proofErr w:type="spellStart"/>
-      <w:r>
-        <w:rPr>
-          <w:i w:val="0"/>
-          <w:iCs w:val="0"/>
-        </w:rPr>
-        <w:t>px</w:t>
-      </w:r>
-      <w:proofErr w:type="spellEnd"/>
-      <w:r>
-        <w:rPr>
-          <w:i w:val="0"/>
-          <w:iCs w:val="0"/>
-        </w:rPr>
-        <w:t>.</w:t>
+        <w:t xml:space="preserve">lexbox vid skärmstorlek större än </w:t>
+      </w:r>
+      <w:r>
+        <w:rPr>
+          <w:i w:val="0"/>
+          <w:iCs w:val="0"/>
+        </w:rPr>
+        <w:t>750 px.</w:t>
       </w:r>
       <w:r>
         <w:rPr>
@@ -4771,17 +4091,8 @@
           <w:i w:val="0"/>
           <w:iCs w:val="0"/>
         </w:rPr>
-        <w:t xml:space="preserve">Bakgrundsbilden på min </w:t>
-      </w:r>
-      <w:proofErr w:type="spellStart"/>
-      <w:r>
-        <w:rPr>
-          <w:i w:val="0"/>
-          <w:iCs w:val="0"/>
-        </w:rPr>
-        <w:t>hero</w:t>
-      </w:r>
-      <w:proofErr w:type="spellEnd"/>
+        <w:t>Bakgrundsbilden på min hero</w:t>
+      </w:r>
       <w:r>
         <w:rPr>
           <w:i w:val="0"/>
@@ -4815,23 +4126,7 @@
           <w:i w:val="0"/>
           <w:iCs w:val="0"/>
         </w:rPr>
-        <w:t>, vilket var resultatet när jag satte genomskinlighet (</w:t>
-      </w:r>
-      <w:proofErr w:type="spellStart"/>
-      <w:r>
-        <w:rPr>
-          <w:i w:val="0"/>
-          <w:iCs w:val="0"/>
-        </w:rPr>
-        <w:t>opacity</w:t>
-      </w:r>
-      <w:proofErr w:type="spellEnd"/>
-      <w:r>
-        <w:rPr>
-          <w:i w:val="0"/>
-          <w:iCs w:val="0"/>
-        </w:rPr>
-        <w:t>)</w:t>
+        <w:t>, vilket var resultatet när jag satte genomskinlighet (opacity)</w:t>
       </w:r>
       <w:r>
         <w:rPr>
@@ -4889,29 +4184,8 @@
         </w:rPr>
         <w:t xml:space="preserve"> och sedan blanda dessa med </w:t>
       </w:r>
-      <w:proofErr w:type="spellStart"/>
-      <w:r>
-        <w:t>background</w:t>
-      </w:r>
-      <w:proofErr w:type="spellEnd"/>
-      <w:r>
-        <w:t>-</w:t>
-      </w:r>
-      <w:proofErr w:type="spellStart"/>
-      <w:r>
-        <w:t>blend</w:t>
-      </w:r>
-      <w:proofErr w:type="spellEnd"/>
-      <w:r>
-        <w:t xml:space="preserve">-mode: </w:t>
-      </w:r>
-      <w:proofErr w:type="spellStart"/>
-      <w:r>
-        <w:t>lighten</w:t>
-      </w:r>
-      <w:proofErr w:type="spellEnd"/>
-      <w:r>
-        <w:t>;</w:t>
+      <w:r>
+        <w:t>background-blend-mode: lighten;</w:t>
       </w:r>
       <w:r>
         <w:t xml:space="preserve"> </w:t>
@@ -5027,13 +4301,8 @@
                               <w:t xml:space="preserve"> </w:t>
                             </w:r>
                             <w:r>
-                              <w:t xml:space="preserve">HTML </w:t>
+                              <w:t>HTML hero</w:t>
                             </w:r>
-                            <w:proofErr w:type="spellStart"/>
-                            <w:r>
-                              <w:t>hero</w:t>
-                            </w:r>
-                            <w:proofErr w:type="spellEnd"/>
                           </w:p>
                         </w:txbxContent>
                       </wps:txbx>
@@ -5071,13 +4340,8 @@
                         <w:t xml:space="preserve"> </w:t>
                       </w:r>
                       <w:r>
-                        <w:t xml:space="preserve">HTML </w:t>
+                        <w:t>HTML hero</w:t>
                       </w:r>
-                      <w:proofErr w:type="spellStart"/>
-                      <w:r>
-                        <w:t>hero</w:t>
-                      </w:r>
-                      <w:proofErr w:type="spellEnd"/>
                     </w:p>
                   </w:txbxContent>
                 </v:textbox>
@@ -5190,13 +4454,8 @@
                               <w:pStyle w:val="Beskrivning"/>
                             </w:pPr>
                             <w:r>
-                              <w:t xml:space="preserve">Figur 7 – CSS </w:t>
+                              <w:t>Figur 7 – CSS hero</w:t>
                             </w:r>
-                            <w:proofErr w:type="spellStart"/>
-                            <w:r>
-                              <w:t>hero</w:t>
-                            </w:r>
-                            <w:proofErr w:type="spellEnd"/>
                           </w:p>
                         </w:txbxContent>
                       </wps:txbx>
@@ -5225,13 +4484,8 @@
                         <w:pStyle w:val="Beskrivning"/>
                       </w:pPr>
                       <w:r>
-                        <w:t xml:space="preserve">Figur 7 – CSS </w:t>
+                        <w:t>Figur 7 – CSS hero</w:t>
                       </w:r>
-                      <w:proofErr w:type="spellStart"/>
-                      <w:r>
-                        <w:t>hero</w:t>
-                      </w:r>
-                      <w:proofErr w:type="spellEnd"/>
                     </w:p>
                   </w:txbxContent>
                 </v:textbox>
@@ -5494,49 +4748,8 @@
           <w:i w:val="0"/>
           <w:iCs w:val="0"/>
         </w:rPr>
-        <w:t xml:space="preserve">Sektionen sortiment på startsidan ligger också på en genomskinlig bakgrund så det löste jag lika som på </w:t>
-      </w:r>
-      <w:proofErr w:type="spellStart"/>
-      <w:r>
-        <w:rPr>
-          <w:i w:val="0"/>
-          <w:iCs w:val="0"/>
-        </w:rPr>
-        <w:t>hero</w:t>
-      </w:r>
-      <w:proofErr w:type="spellEnd"/>
-      <w:r>
-        <w:rPr>
-          <w:i w:val="0"/>
-          <w:iCs w:val="0"/>
-        </w:rPr>
-        <w:t xml:space="preserve">-sektionen. Sedan ville jag att sortiment-sektionen skulle ändra utseende två gånger när skärmen blev större. Det löste jag genom att lägga två tomma element, ett före och ett efter. Med en media </w:t>
-      </w:r>
-      <w:proofErr w:type="spellStart"/>
-      <w:r>
-        <w:rPr>
-          <w:i w:val="0"/>
-          <w:iCs w:val="0"/>
-        </w:rPr>
-        <w:t>query</w:t>
-      </w:r>
-      <w:proofErr w:type="spellEnd"/>
-      <w:r>
-        <w:rPr>
-          <w:i w:val="0"/>
-          <w:iCs w:val="0"/>
-        </w:rPr>
-        <w:t xml:space="preserve"> på minsta skärmstorlek 750 </w:t>
-      </w:r>
-      <w:proofErr w:type="spellStart"/>
-      <w:r>
-        <w:rPr>
-          <w:i w:val="0"/>
-          <w:iCs w:val="0"/>
-        </w:rPr>
-        <w:t>px</w:t>
-      </w:r>
-      <w:proofErr w:type="spellEnd"/>
+        <w:t>Sektionen sortiment på startsidan ligger också på en genomskinlig bakgrund så det löste jag lika som på hero-sektionen. Sedan ville jag att sortiment-sektionen skulle ändra utseende två gånger när skärmen blev större. Det löste jag genom att lägga två tomma element, ett före och ett efter. Med en media query på minsta skärmstorlek 750 px</w:t>
+      </w:r>
       <w:r>
         <w:rPr>
           <w:i w:val="0"/>
@@ -5544,7 +4757,6 @@
         </w:rPr>
         <w:t xml:space="preserve">, lade jag till innehåll i det första tomma elementet och med </w:t>
       </w:r>
-      <w:proofErr w:type="spellStart"/>
       <w:r>
         <w:rPr>
           <w:i w:val="0"/>
@@ -5557,47 +4769,7 @@
           <w:i w:val="0"/>
           <w:iCs w:val="0"/>
         </w:rPr>
-        <w:t>lexbox</w:t>
-      </w:r>
-      <w:proofErr w:type="spellEnd"/>
-      <w:r>
-        <w:rPr>
-          <w:i w:val="0"/>
-          <w:iCs w:val="0"/>
-        </w:rPr>
-        <w:t xml:space="preserve"> gjorde detta att jag fick två element bredvid varandra. Sortiment-sektionen till höger och en bild till vänster. Sedan lade jag till en till media </w:t>
-      </w:r>
-      <w:proofErr w:type="spellStart"/>
-      <w:r>
-        <w:rPr>
-          <w:i w:val="0"/>
-          <w:iCs w:val="0"/>
-        </w:rPr>
-        <w:t>query</w:t>
-      </w:r>
-      <w:proofErr w:type="spellEnd"/>
-      <w:r>
-        <w:rPr>
-          <w:i w:val="0"/>
-          <w:iCs w:val="0"/>
-        </w:rPr>
-        <w:t xml:space="preserve"> vid minsta skärmstorlek 1000 </w:t>
-      </w:r>
-      <w:proofErr w:type="spellStart"/>
-      <w:r>
-        <w:rPr>
-          <w:i w:val="0"/>
-          <w:iCs w:val="0"/>
-        </w:rPr>
-        <w:t>px</w:t>
-      </w:r>
-      <w:proofErr w:type="spellEnd"/>
-      <w:r>
-        <w:rPr>
-          <w:i w:val="0"/>
-          <w:iCs w:val="0"/>
-        </w:rPr>
-        <w:t xml:space="preserve"> och där läggs också innehåll i det andra tomma elementet till och resultatet blev tre element bredvid varandra. Sortiment-sektionen i mitten och en bild på varje sida. </w:t>
+        <w:t xml:space="preserve">lexbox gjorde detta att jag fick två element bredvid varandra. Sortiment-sektionen till höger och en bild till vänster. Sedan lade jag till en till media query vid minsta skärmstorlek 1000 px och där läggs också innehåll i det andra tomma elementet till och resultatet blev tre element bredvid varandra. Sortiment-sektionen i mitten och en bild på varje sida. </w:t>
       </w:r>
     </w:p>
     <w:p>
@@ -5622,23 +4794,7 @@
           <w:i w:val="0"/>
           <w:iCs w:val="0"/>
         </w:rPr>
-        <w:t xml:space="preserve">Sidfoten är också den positionerad med </w:t>
-      </w:r>
-      <w:proofErr w:type="spellStart"/>
-      <w:r>
-        <w:rPr>
-          <w:i w:val="0"/>
-          <w:iCs w:val="0"/>
-        </w:rPr>
-        <w:t>flexbox</w:t>
-      </w:r>
-      <w:proofErr w:type="spellEnd"/>
-      <w:r>
-        <w:rPr>
-          <w:i w:val="0"/>
-          <w:iCs w:val="0"/>
-        </w:rPr>
-        <w:t xml:space="preserve"> eftersom jag vill rada upp elementen horisontellt.</w:t>
+        <w:t>Sidfoten är också den positionerad med flexbox eftersom jag vill rada upp elementen horisontellt.</w:t>
       </w:r>
     </w:p>
     <w:p>
@@ -5821,33 +4977,8 @@
           <w:i w:val="0"/>
           <w:iCs w:val="0"/>
         </w:rPr>
-        <w:t xml:space="preserve"> bild 1, text 1, bild 2 och text 2. Sedan använder jag media </w:t>
-      </w:r>
-      <w:proofErr w:type="spellStart"/>
-      <w:r>
-        <w:rPr>
-          <w:i w:val="0"/>
-          <w:iCs w:val="0"/>
-        </w:rPr>
-        <w:t>query</w:t>
-      </w:r>
-      <w:proofErr w:type="spellEnd"/>
-      <w:r>
-        <w:rPr>
-          <w:i w:val="0"/>
-          <w:iCs w:val="0"/>
-        </w:rPr>
-        <w:t xml:space="preserve"> för att ändra till två kolumner vid större skärmbredd. Men jag positionerar också elementen efter </w:t>
-      </w:r>
-      <w:proofErr w:type="spellStart"/>
-      <w:r>
-        <w:rPr>
-          <w:i w:val="0"/>
-          <w:iCs w:val="0"/>
-        </w:rPr>
-        <w:t>grid</w:t>
-      </w:r>
-      <w:proofErr w:type="spellEnd"/>
+        <w:t xml:space="preserve"> bild 1, text 1, bild 2 och text 2. Sedan använder jag media query för att ändra till två kolumner vid större skärmbredd. Men jag positionerar också elementen efter grid</w:t>
+      </w:r>
       <w:r>
         <w:rPr>
           <w:i w:val="0"/>
@@ -5869,6 +5000,13 @@
         </w:rPr>
         <w:t>na för att flytta bild två till höger och text två till vänster.</w:t>
       </w:r>
+      <w:r>
+        <w:rPr>
+          <w:i w:val="0"/>
+          <w:iCs w:val="0"/>
+        </w:rPr>
+        <w:t xml:space="preserve"> Denna lösning kom jag på i ett senare skede. Först hade jag lagt till en extra bild som låg nedanför i HTML-koden och därför naturligt placerades till höger. Sedan visade/döljde jag bilderna i en media query.</w:t>
+      </w:r>
     </w:p>
     <w:p>
       <w:pPr>
@@ -5887,12 +5025,201 @@
           <w:iCs w:val="0"/>
         </w:rPr>
       </w:pPr>
-      <w:r>
-        <w:rPr>
-          <w:i w:val="0"/>
-          <w:iCs w:val="0"/>
-        </w:rPr>
-        <w:t>https://developer.mozilla.org/en-US/docs/Web/CSS/Guides/Grid_layout/Basic_concepts</w:t>
+      <w:hyperlink r:id="rId25" w:history="1">
+        <w:r>
+          <w:rPr>
+            <w:rStyle w:val="Hyperlnk"/>
+            <w:i w:val="0"/>
+            <w:iCs w:val="0"/>
+          </w:rPr>
+          <w:t>https://developer.mozilla.org/en-US/docs/Web/CSS/Guides/Grid_layout/Basic_concepts</w:t>
+        </w:r>
+      </w:hyperlink>
+    </w:p>
+    <w:p>
+      <w:pPr>
+        <w:pStyle w:val="Beskrivning"/>
+        <w:rPr>
+          <w:i w:val="0"/>
+          <w:iCs w:val="0"/>
+        </w:rPr>
+      </w:pPr>
+    </w:p>
+    <w:p>
+      <w:pPr>
+        <w:pStyle w:val="Beskrivning"/>
+        <w:rPr>
+          <w:i w:val="0"/>
+          <w:iCs w:val="0"/>
+        </w:rPr>
+      </w:pPr>
+      <w:r>
+        <w:rPr>
+          <w:i w:val="0"/>
+          <w:iCs w:val="0"/>
+        </w:rPr>
+        <w:t>Även på sortiment-sidan har jag använt CSS Grid för att positionera elementen. Här har jag gjort en grid med sex kolumner och använder ”span” för att specificera hur breda de olika elementen ska vara.</w:t>
+      </w:r>
+    </w:p>
+    <w:p>
+      <w:pPr>
+        <w:pStyle w:val="Rubrik2"/>
+      </w:pPr>
+      <w:r>
+        <w:t>JavaScript</w:t>
+      </w:r>
+    </w:p>
+    <w:p>
+      <w:pPr>
+        <w:pStyle w:val="Beskrivning"/>
+        <w:rPr>
+          <w:i w:val="0"/>
+          <w:iCs w:val="0"/>
+        </w:rPr>
+      </w:pPr>
+      <w:r>
+        <w:rPr>
+          <w:i w:val="0"/>
+          <w:iCs w:val="0"/>
+        </w:rPr>
+        <w:t>Hamburgermenyn som syns på liten skärm får sin funktionalitet genom JavaScript.</w:t>
+      </w:r>
+      <w:r>
+        <w:rPr>
+          <w:i w:val="0"/>
+          <w:iCs w:val="0"/>
+        </w:rPr>
+        <w:t xml:space="preserve"> Jag har tagit hjälp av den instruktionsfilm för hamburgermeny som finns i kursmaterialet av Rama Bito. Jag använder </w:t>
+      </w:r>
+      <w:r>
+        <w:rPr>
+          <w:i w:val="0"/>
+          <w:iCs w:val="0"/>
+        </w:rPr>
+        <w:t xml:space="preserve">en händelselyssnare som vid klick på hamburgerikonen kör en funktion som använder metoden toggle() för att växla mellan att lägga till eller ta bort klassen ”open” på menyn. På så vis syns menyn när man klickat på ikonen och döljs igen om man klickar igen. </w:t>
+      </w:r>
+    </w:p>
+    <w:p>
+      <w:pPr>
+        <w:pStyle w:val="Beskrivning"/>
+        <w:rPr>
+          <w:i w:val="0"/>
+          <w:iCs w:val="0"/>
+        </w:rPr>
+      </w:pPr>
+      <w:r>
+        <w:rPr>
+          <w:i w:val="0"/>
+          <w:iCs w:val="0"/>
+        </w:rPr>
+        <w:t xml:space="preserve">Nästa sida där det finns JavaScript är på sortimentsidan. </w:t>
+      </w:r>
+      <w:r>
+        <w:rPr>
+          <w:i w:val="0"/>
+          <w:iCs w:val="0"/>
+        </w:rPr>
+        <w:t xml:space="preserve">Detta skript ligger i en egen js-fil för att hålla koden separerad och lättläst. </w:t>
+      </w:r>
+      <w:r>
+        <w:rPr>
+          <w:i w:val="0"/>
+          <w:iCs w:val="0"/>
+        </w:rPr>
+        <w:t>Här har jag valt att lägga artiklarna i två olika json-filer</w:t>
+      </w:r>
+      <w:r>
+        <w:rPr>
+          <w:i w:val="0"/>
+          <w:iCs w:val="0"/>
+        </w:rPr>
+        <w:t>, en för varje kategori,</w:t>
+      </w:r>
+      <w:r>
+        <w:rPr>
+          <w:i w:val="0"/>
+          <w:iCs w:val="0"/>
+        </w:rPr>
+        <w:t xml:space="preserve"> och sedan använda JavaScript för att hämta in datan från filerna i asynkron</w:t>
+      </w:r>
+      <w:r>
+        <w:rPr>
+          <w:i w:val="0"/>
+          <w:iCs w:val="0"/>
+        </w:rPr>
+        <w:t>a</w:t>
+      </w:r>
+      <w:r>
+        <w:rPr>
+          <w:i w:val="0"/>
+          <w:iCs w:val="0"/>
+        </w:rPr>
+        <w:t xml:space="preserve"> funktion</w:t>
+      </w:r>
+      <w:r>
+        <w:rPr>
+          <w:i w:val="0"/>
+          <w:iCs w:val="0"/>
+        </w:rPr>
+        <w:t>er</w:t>
+      </w:r>
+      <w:r>
+        <w:rPr>
+          <w:i w:val="0"/>
+          <w:iCs w:val="0"/>
+        </w:rPr>
+        <w:t xml:space="preserve"> där jag använder await fetch. </w:t>
+      </w:r>
+      <w:r>
+        <w:rPr>
+          <w:i w:val="0"/>
+          <w:iCs w:val="0"/>
+        </w:rPr>
+        <w:t>Funktionen körs när användaren klickar på någon av bilderna ”Matbröd” eller ”Fikabröd”</w:t>
+      </w:r>
+      <w:r>
+        <w:rPr>
+          <w:i w:val="0"/>
+          <w:iCs w:val="0"/>
+        </w:rPr>
+        <w:t xml:space="preserve"> och skriver ut artiklarna från vald kategori till </w:t>
+      </w:r>
+      <w:r>
+        <w:rPr>
+          <w:i w:val="0"/>
+          <w:iCs w:val="0"/>
+        </w:rPr>
+        <w:t>sidan</w:t>
+      </w:r>
+      <w:r>
+        <w:rPr>
+          <w:i w:val="0"/>
+          <w:iCs w:val="0"/>
+        </w:rPr>
+        <w:t>.</w:t>
+      </w:r>
+    </w:p>
+    <w:p>
+      <w:pPr>
+        <w:pStyle w:val="Beskrivning"/>
+        <w:rPr>
+          <w:i w:val="0"/>
+          <w:iCs w:val="0"/>
+        </w:rPr>
+      </w:pPr>
+      <w:r>
+        <w:rPr>
+          <w:i w:val="0"/>
+          <w:iCs w:val="0"/>
+        </w:rPr>
+        <w:t>Formuläret på kontaktsidan valideras också med JavaScript. Även här ligger detta skript i en egen js-fil.</w:t>
+      </w:r>
+      <w:r>
+        <w:rPr>
+          <w:i w:val="0"/>
+          <w:iCs w:val="0"/>
+        </w:rPr>
+        <w:t xml:space="preserve"> Valideringen sker när skicka knappen klickas genom en händelselyssnare. Formulärfälten kontrolleras genom if-satser som genererar fel ifall fälten är tomma. Felen loggas i en lista (array) som sedan skrivs ut som felmeddelanden på sidan. När alla fält är ifyllda kan formuläret skickas. På denna webbplats har jag inte lagt till funktionalitet för att ta hand om den skickade informationen men ett meddelande skrivs ut på sidan om att meddelandet har skickats.</w:t>
       </w:r>
     </w:p>
     <w:p>
@@ -5939,23 +5266,7 @@
         <w:jc w:val="left"/>
       </w:pPr>
       <w:r>
-        <w:t xml:space="preserve">Resultatkapitlet ingår när du har genomfört en systematisk undersökning, </w:t>
-      </w:r>
-      <w:proofErr w:type="gramStart"/>
-      <w:r>
-        <w:t>t ex</w:t>
-      </w:r>
-      <w:proofErr w:type="gramEnd"/>
-      <w:r>
-        <w:t xml:space="preserve"> en utvärdering av ett datorprogram som du har utvecklat, vilket krävs inom examensarbeten på C- och D-nivå. I resultatkapitlet redovisas objektiva resultat av en empirisk undersökning., </w:t>
-      </w:r>
-      <w:proofErr w:type="gramStart"/>
-      <w:r>
-        <w:t>t ex</w:t>
-      </w:r>
-      <w:proofErr w:type="gramEnd"/>
-      <w:r>
-        <w:t xml:space="preserve"> en sådan utvärdering som nämns ovan. Tänk på att eventuella kommentarer i detta kapitel endast får vara av förtydligande art. Dina egna synpunkter och subjektiva (personliga) kommentarer hör hemma i kapitlet Slutsatser/Analys/Diskussion.</w:t>
+        <w:t>Resultatkapitlet ingår när du har genomfört en systematisk undersökning, t ex en utvärdering av ett datorprogram som du har utvecklat, vilket krävs inom examensarbeten på C- och D-nivå. I resultatkapitlet redovisas objektiva resultat av en empirisk undersökning., t ex en sådan utvärdering som nämns ovan. Tänk på att eventuella kommentarer i detta kapitel endast får vara av förtydligande art. Dina egna synpunkter och subjektiva (personliga) kommentarer hör hemma i kapitlet Slutsatser/Analys/Diskussion.</w:t>
       </w:r>
     </w:p>
     <w:p>
@@ -6003,15 +5314,7 @@
         <w:jc w:val="left"/>
       </w:pPr>
       <w:r>
-        <w:t xml:space="preserve">Om denna del är omfattande kan den indelas i flera kapitel eller under-kapitel, </w:t>
-      </w:r>
-      <w:proofErr w:type="gramStart"/>
-      <w:r>
-        <w:t>t ex</w:t>
-      </w:r>
-      <w:proofErr w:type="gramEnd"/>
-      <w:r>
-        <w:t xml:space="preserve"> ett analys- eller diskussionskapitel med förklaringar till och kritisk granskning av resultaten, ett slutsatskapitel där de viktigaste resultaten och slutsatserna presenteras, samt ett avsnitt med förslag på fortsatt arbete inom området.</w:t>
+        <w:t>Om denna del är omfattande kan den indelas i flera kapitel eller under-kapitel, t ex ett analys- eller diskussionskapitel med förklaringar till och kritisk granskning av resultaten, ett slutsatskapitel där de viktigaste resultaten och slutsatserna presenteras, samt ett avsnitt med förslag på fortsatt arbete inom området.</w:t>
       </w:r>
     </w:p>
     <w:p>
@@ -6102,23 +5405,9 @@
         <w:rPr>
           <w:lang w:val="en-GB"/>
         </w:rPr>
-        <w:t>Monash University</w:t>
-      </w:r>
-      <w:proofErr w:type="gramStart"/>
-      <w:r>
-        <w:rPr>
-          <w:lang w:val="en-GB"/>
-        </w:rPr>
-        <w:t>, ”Citing</w:t>
-      </w:r>
-      <w:proofErr w:type="gramEnd"/>
-      <w:r>
-        <w:rPr>
-          <w:lang w:val="en-GB"/>
-        </w:rPr>
-        <w:t xml:space="preserve">, Vancouver Style” </w:t>
-      </w:r>
-      <w:hyperlink r:id="rId25" w:history="1">
+        <w:t xml:space="preserve">Monash University, ”Citing, Vancouver Style” </w:t>
+      </w:r>
+      <w:hyperlink r:id="rId26" w:history="1">
         <w:r>
           <w:rPr>
             <w:lang w:val="en-GB"/>
@@ -6130,21 +5419,7 @@
         <w:rPr>
           <w:lang w:val="en-GB"/>
         </w:rPr>
-        <w:t xml:space="preserve"> </w:t>
-      </w:r>
-      <w:proofErr w:type="spellStart"/>
-      <w:r>
-        <w:rPr>
-          <w:lang w:val="en-GB"/>
-        </w:rPr>
-        <w:t>Publicerad</w:t>
-      </w:r>
-      <w:proofErr w:type="spellEnd"/>
-      <w:r>
-        <w:rPr>
-          <w:lang w:val="en-GB"/>
-        </w:rPr>
-        <w:t xml:space="preserve"> 2006-04-13. </w:t>
+        <w:t xml:space="preserve"> Publicerad 2006-04-13. </w:t>
       </w:r>
       <w:r>
         <w:t>Hämtad 2012-01-25 (Exempel på referens till webbsida)</w:t>
@@ -6186,21 +5461,7 @@
         <w:rPr>
           <w:lang w:val="en-GB"/>
         </w:rPr>
-        <w:t>M. Eriksson</w:t>
-      </w:r>
-      <w:proofErr w:type="gramStart"/>
-      <w:r>
-        <w:rPr>
-          <w:lang w:val="en-GB"/>
-        </w:rPr>
-        <w:t>, ”Dynamic</w:t>
-      </w:r>
-      <w:proofErr w:type="gramEnd"/>
-      <w:r>
-        <w:rPr>
-          <w:lang w:val="en-GB"/>
-        </w:rPr>
-        <w:t xml:space="preserve"> Single Frequency Networks”, </w:t>
+        <w:t xml:space="preserve">M. Eriksson, ”Dynamic Single Frequency Networks”, </w:t>
       </w:r>
       <w:r>
         <w:rPr>
@@ -6256,15 +5517,7 @@
       </w:pPr>
       <w:bookmarkStart w:id="5" w:name="__RefNumPara__1427_1373209633"/>
       <w:r>
-        <w:t xml:space="preserve">L. </w:t>
-      </w:r>
-      <w:proofErr w:type="spellStart"/>
-      <w:r>
-        <w:t>Forsslund</w:t>
-      </w:r>
-      <w:proofErr w:type="spellEnd"/>
-      <w:r>
-        <w:t>, ”Rapportering av forskningsresultat - ett rationaliserings-</w:t>
+        <w:t>L. Forsslund, ”Rapportering av forskningsresultat - ett rationaliserings-</w:t>
       </w:r>
       <w:r>
         <w:br/>
@@ -6278,15 +5531,7 @@
         <w:t>Industriell teknik</w:t>
       </w:r>
       <w:r>
-        <w:t xml:space="preserve">, 22, 1969, s. </w:t>
-      </w:r>
-      <w:proofErr w:type="gramStart"/>
-      <w:r>
-        <w:t>361-363</w:t>
-      </w:r>
-      <w:proofErr w:type="gramEnd"/>
-      <w:r>
-        <w:t>. (Exempel på referens till artikel i tidskrift)</w:t>
+        <w:t>, 22, 1969, s. 361-363. (Exempel på referens till artikel i tidskrift)</w:t>
       </w:r>
       <w:bookmarkEnd w:id="5"/>
     </w:p>
@@ -6299,15 +5544,7 @@
         </w:numPr>
       </w:pPr>
       <w:r>
-        <w:t xml:space="preserve">N. </w:t>
-      </w:r>
-      <w:proofErr w:type="spellStart"/>
-      <w:r>
-        <w:t>Bie</w:t>
-      </w:r>
-      <w:proofErr w:type="spellEnd"/>
-      <w:r>
-        <w:t xml:space="preserve">, “Minspel på Internet”. </w:t>
+        <w:t xml:space="preserve">N. Bie, “Minspel på Internet”. </w:t>
       </w:r>
       <w:r>
         <w:rPr>
@@ -6349,30 +5586,10 @@
           <w:i/>
           <w:iCs/>
         </w:rPr>
-        <w:t xml:space="preserve">Växelboken. Kuggväxlar, kuggremmar, kilremmar </w:t>
-      </w:r>
-      <w:proofErr w:type="gramStart"/>
-      <w:r>
-        <w:rPr>
-          <w:i/>
-          <w:iCs/>
-        </w:rPr>
-        <w:t>etc</w:t>
-      </w:r>
-      <w:r>
-        <w:t>.</w:t>
-      </w:r>
-      <w:proofErr w:type="gramEnd"/>
-      <w:r>
-        <w:t xml:space="preserve"> </w:t>
-      </w:r>
-      <w:proofErr w:type="spellStart"/>
-      <w:r>
-        <w:t>Mecman</w:t>
-      </w:r>
-      <w:proofErr w:type="spellEnd"/>
-      <w:r>
-        <w:t>. Hydraulik, SKF. Huvudkatalog. (Exempel på referens till katalog)</w:t>
+        <w:t>Växelboken. Kuggväxlar, kuggremmar, kilremmar etc</w:t>
+      </w:r>
+      <w:r>
+        <w:t>. Mecman. Hydraulik, SKF. Huvudkatalog. (Exempel på referens till katalog)</w:t>
       </w:r>
       <w:bookmarkEnd w:id="6"/>
     </w:p>
@@ -6447,8 +5664,8 @@
       </w:pPr>
     </w:p>
     <w:sectPr>
-      <w:headerReference w:type="default" r:id="rId26"/>
-      <w:footerReference w:type="default" r:id="rId27"/>
+      <w:headerReference w:type="default" r:id="rId27"/>
+      <w:footerReference w:type="default" r:id="rId28"/>
       <w:pgSz w:w="11906" w:h="16838"/>
       <w:pgMar w:top="1700" w:right="2098" w:bottom="1326" w:left="2098" w:header="1134" w:footer="760" w:gutter="0"/>
       <w:pgNumType w:start="1"/>
@@ -6595,13 +5812,8 @@
       </w:tabs>
     </w:pPr>
     <w:r>
-      <w:t xml:space="preserve">Title – </w:t>
+      <w:t>Title – Subtitle</w:t>
     </w:r>
-    <w:proofErr w:type="spellStart"/>
-    <w:r>
-      <w:t>Subtitle</w:t>
-    </w:r>
-    <w:proofErr w:type="spellEnd"/>
   </w:p>
   <w:p>
     <w:pPr>
@@ -6612,11 +5824,9 @@
         <w:tab w:val="right" w:pos="7725"/>
       </w:tabs>
     </w:pPr>
-    <w:proofErr w:type="spellStart"/>
     <w:r>
       <w:t>Author</w:t>
     </w:r>
-    <w:proofErr w:type="spellEnd"/>
     <w:r>
       <w:tab/>
       <w:t>2010-07-05</w:t>

</xml_diff>